<commit_message>
Finalização dos exercícios caixa preta
</commit_message>
<xml_diff>
--- a/Exercícios Teste Caixa Preta (1) (1).docx
+++ b/Exercícios Teste Caixa Preta (1) (1).docx
@@ -4116,25 +4116,7 @@
           <w:szCs w:val="22"/>
           <w:lang w:val="en-US"/>
         </w:rPr>
-        <w:t xml:space="preserve"> “</w:t>
-      </w:r>
-      <w:r>
-        <w:rPr>
-          <w:rFonts w:ascii="Arial" w:hAnsi="Arial" w:cs="Arial"/>
-          <w:sz w:val="22"/>
-          <w:szCs w:val="22"/>
-          <w:lang w:val="en-US"/>
-        </w:rPr>
-        <w:t>c</w:t>
-      </w:r>
-      <w:r>
-        <w:rPr>
-          <w:rFonts w:ascii="Arial" w:hAnsi="Arial" w:cs="Arial"/>
-          <w:sz w:val="22"/>
-          <w:szCs w:val="22"/>
-          <w:lang w:val="en-US"/>
-        </w:rPr>
-        <w:t>”</w:t>
+        <w:t xml:space="preserve"> “c”</w:t>
       </w:r>
     </w:p>
     <w:p>
@@ -4530,16 +4512,7 @@
           <w:szCs w:val="22"/>
           <w:lang w:val="en-US"/>
         </w:rPr>
-        <w:t xml:space="preserve"> ???? </w:t>
-      </w:r>
-      <w:r>
-        <w:rPr>
-          <w:rFonts w:ascii="Arial" w:hAnsi="Arial" w:cs="Arial"/>
-          <w:sz w:val="22"/>
-          <w:szCs w:val="22"/>
-          <w:lang w:val="en-US"/>
-        </w:rPr>
-        <w:t xml:space="preserve">o </w:t>
+        <w:t xml:space="preserve"> ???? o </w:t>
       </w:r>
       <w:proofErr w:type="spellStart"/>
       <w:r>
@@ -8341,25 +8314,19 @@
       <w:pPr>
         <w:rPr>
           <w:rFonts w:ascii="Arial" w:hAnsi="Arial" w:cs="Arial"/>
-          <w:sz w:val="22"/>
-          <w:szCs w:val="22"/>
-        </w:rPr>
-      </w:pPr>
-      <w:r>
-        <w:rPr>
-          <w:rFonts w:ascii="Arial" w:hAnsi="Arial" w:cs="Arial"/>
-          <w:sz w:val="22"/>
-          <w:szCs w:val="22"/>
-        </w:rPr>
-        <w:t xml:space="preserve">Casos de teste das classes </w:t>
-      </w:r>
-      <w:r>
-        <w:rPr>
-          <w:rFonts w:ascii="Arial" w:hAnsi="Arial" w:cs="Arial"/>
-          <w:sz w:val="22"/>
-          <w:szCs w:val="22"/>
-        </w:rPr>
-        <w:t xml:space="preserve">válidas: </w:t>
+          <w:color w:val="0070C0"/>
+          <w:sz w:val="22"/>
+          <w:szCs w:val="22"/>
+        </w:rPr>
+      </w:pPr>
+      <w:r>
+        <w:rPr>
+          <w:rFonts w:ascii="Arial" w:hAnsi="Arial" w:cs="Arial"/>
+          <w:color w:val="0070C0"/>
+          <w:sz w:val="22"/>
+          <w:szCs w:val="22"/>
+        </w:rPr>
+        <w:t xml:space="preserve">Casos de teste das classes válidas: </w:t>
       </w:r>
     </w:p>
     <w:p>
@@ -8371,51 +8338,19 @@
         </w:numPr>
         <w:rPr>
           <w:rFonts w:ascii="Arial" w:hAnsi="Arial" w:cs="Arial"/>
-          <w:sz w:val="22"/>
-          <w:szCs w:val="22"/>
-        </w:rPr>
-      </w:pPr>
-      <w:r>
-        <w:rPr>
-          <w:rFonts w:ascii="Arial" w:hAnsi="Arial" w:cs="Arial"/>
-          <w:sz w:val="22"/>
-          <w:szCs w:val="22"/>
-        </w:rPr>
-        <w:t>CT1(atinge classes 1, 3, 5, 7:</w:t>
-      </w:r>
-      <w:r>
-        <w:rPr>
-          <w:rFonts w:ascii="Arial" w:hAnsi="Arial" w:cs="Arial"/>
-          <w:color w:val="FF0000"/>
-          <w:sz w:val="22"/>
-          <w:szCs w:val="22"/>
-        </w:rPr>
-        <w:t>LII</w:t>
-      </w:r>
-      <w:r>
-        <w:rPr>
-          <w:rFonts w:ascii="Arial" w:hAnsi="Arial" w:cs="Arial"/>
-          <w:sz w:val="22"/>
-          <w:szCs w:val="22"/>
-        </w:rPr>
-        <w:t>, 10:</w:t>
-      </w:r>
-      <w:r>
-        <w:rPr>
-          <w:rFonts w:ascii="Arial" w:hAnsi="Arial" w:cs="Arial"/>
-          <w:color w:val="FF0000"/>
-          <w:sz w:val="22"/>
-          <w:szCs w:val="22"/>
-        </w:rPr>
-        <w:t>LSI</w:t>
-      </w:r>
-      <w:r>
-        <w:rPr>
-          <w:rFonts w:ascii="Arial" w:hAnsi="Arial" w:cs="Arial"/>
-          <w:sz w:val="22"/>
-          <w:szCs w:val="22"/>
-        </w:rPr>
-        <w:t>)</w:t>
+          <w:color w:val="0070C0"/>
+          <w:sz w:val="22"/>
+          <w:szCs w:val="22"/>
+        </w:rPr>
+      </w:pPr>
+      <w:r>
+        <w:rPr>
+          <w:rFonts w:ascii="Arial" w:hAnsi="Arial" w:cs="Arial"/>
+          <w:color w:val="0070C0"/>
+          <w:sz w:val="22"/>
+          <w:szCs w:val="22"/>
+        </w:rPr>
+        <w:t>CT1(atinge classes 1, 3, 5, 7:LII, 10:LSI)</w:t>
       </w:r>
     </w:p>
     <w:p>
@@ -8423,14 +8358,16 @@
         <w:pStyle w:val="PargrafodaLista"/>
         <w:rPr>
           <w:rFonts w:ascii="Arial" w:hAnsi="Arial" w:cs="Arial"/>
-          <w:sz w:val="22"/>
-          <w:szCs w:val="22"/>
-        </w:rPr>
-      </w:pPr>
-      <w:proofErr w:type="spellStart"/>
-      <w:r>
-        <w:rPr>
-          <w:rFonts w:ascii="Arial" w:hAnsi="Arial" w:cs="Arial"/>
+          <w:color w:val="0070C0"/>
+          <w:sz w:val="22"/>
+          <w:szCs w:val="22"/>
+        </w:rPr>
+      </w:pPr>
+      <w:proofErr w:type="spellStart"/>
+      <w:r>
+        <w:rPr>
+          <w:rFonts w:ascii="Arial" w:hAnsi="Arial" w:cs="Arial"/>
+          <w:color w:val="0070C0"/>
           <w:sz w:val="22"/>
           <w:szCs w:val="22"/>
         </w:rPr>
@@ -8440,6 +8377,7 @@
       <w:r>
         <w:rPr>
           <w:rFonts w:ascii="Arial" w:hAnsi="Arial" w:cs="Arial"/>
+          <w:color w:val="0070C0"/>
           <w:sz w:val="22"/>
           <w:szCs w:val="22"/>
         </w:rPr>
@@ -8450,6 +8388,7 @@
       <w:r>
         <w:rPr>
           <w:rFonts w:ascii="Arial" w:hAnsi="Arial" w:cs="Arial"/>
+          <w:color w:val="0070C0"/>
           <w:sz w:val="22"/>
           <w:szCs w:val="22"/>
         </w:rPr>
@@ -8459,6 +8398,7 @@
       <w:r>
         <w:rPr>
           <w:rFonts w:ascii="Arial" w:hAnsi="Arial" w:cs="Arial"/>
+          <w:color w:val="0070C0"/>
           <w:sz w:val="22"/>
           <w:szCs w:val="22"/>
         </w:rPr>
@@ -8468,44 +8408,11 @@
       <w:r>
         <w:rPr>
           <w:rFonts w:ascii="Arial" w:hAnsi="Arial" w:cs="Arial"/>
-          <w:sz w:val="22"/>
-          <w:szCs w:val="22"/>
-        </w:rPr>
-        <w:t>“29571”,</w:t>
-      </w:r>
-      <w:r>
-        <w:rPr>
-          <w:rFonts w:ascii="Arial" w:hAnsi="Arial" w:cs="Arial"/>
-          <w:color w:val="FF0000"/>
-          <w:sz w:val="22"/>
-          <w:szCs w:val="22"/>
-        </w:rPr>
-        <w:t>0</w:t>
-      </w:r>
-      <w:r>
-        <w:rPr>
-          <w:rFonts w:ascii="Arial" w:hAnsi="Arial" w:cs="Arial"/>
-          <w:sz w:val="22"/>
-          <w:szCs w:val="22"/>
-        </w:rPr>
-        <w:t xml:space="preserve">, </w:t>
-      </w:r>
-      <w:r>
-        <w:rPr>
-          <w:rFonts w:ascii="Arial" w:hAnsi="Arial" w:cs="Arial"/>
-          <w:color w:val="FF0000"/>
-          <w:sz w:val="22"/>
-          <w:szCs w:val="22"/>
-        </w:rPr>
-        <w:t>4</w:t>
-      </w:r>
-      <w:r>
-        <w:rPr>
-          <w:rFonts w:ascii="Arial" w:hAnsi="Arial" w:cs="Arial"/>
-          <w:sz w:val="22"/>
-          <w:szCs w:val="22"/>
-        </w:rPr>
-        <w:t>); //deve retornar 29571</w:t>
+          <w:color w:val="0070C0"/>
+          <w:sz w:val="22"/>
+          <w:szCs w:val="22"/>
+        </w:rPr>
+        <w:t>“29571”,0, 4); //deve retornar 29571</w:t>
       </w:r>
     </w:p>
     <w:p>
@@ -8517,21 +8424,86 @@
         </w:numPr>
         <w:rPr>
           <w:rFonts w:ascii="Arial" w:hAnsi="Arial" w:cs="Arial"/>
-          <w:sz w:val="22"/>
-          <w:szCs w:val="22"/>
-        </w:rPr>
-      </w:pPr>
-      <w:r>
-        <w:rPr>
-          <w:rFonts w:ascii="Arial" w:hAnsi="Arial" w:cs="Arial"/>
-          <w:sz w:val="22"/>
-          <w:szCs w:val="22"/>
-        </w:rPr>
-        <w:t>CT</w:t>
-      </w:r>
-      <w:r>
-        <w:rPr>
-          <w:rFonts w:ascii="Arial" w:hAnsi="Arial" w:cs="Arial"/>
+          <w:color w:val="0070C0"/>
+          <w:sz w:val="22"/>
+          <w:szCs w:val="22"/>
+        </w:rPr>
+      </w:pPr>
+      <w:r>
+        <w:rPr>
+          <w:rFonts w:ascii="Arial" w:hAnsi="Arial" w:cs="Arial"/>
+          <w:color w:val="0070C0"/>
+          <w:sz w:val="22"/>
+          <w:szCs w:val="22"/>
+        </w:rPr>
+        <w:t>CT2(atinge classes 1, 3, 5, 7:LSI, 10:LII)</w:t>
+      </w:r>
+    </w:p>
+    <w:p>
+      <w:pPr>
+        <w:pStyle w:val="PargrafodaLista"/>
+        <w:rPr>
+          <w:rFonts w:ascii="Arial" w:hAnsi="Arial" w:cs="Arial"/>
+          <w:color w:val="0070C0"/>
+          <w:sz w:val="22"/>
+          <w:szCs w:val="22"/>
+        </w:rPr>
+      </w:pPr>
+      <w:proofErr w:type="spellStart"/>
+      <w:r>
+        <w:rPr>
+          <w:rFonts w:ascii="Arial" w:hAnsi="Arial" w:cs="Arial"/>
+          <w:color w:val="0070C0"/>
+          <w:sz w:val="22"/>
+          <w:szCs w:val="22"/>
+        </w:rPr>
+        <w:t>Int</w:t>
+      </w:r>
+      <w:proofErr w:type="spellEnd"/>
+      <w:r>
+        <w:rPr>
+          <w:rFonts w:ascii="Arial" w:hAnsi="Arial" w:cs="Arial"/>
+          <w:color w:val="0070C0"/>
+          <w:sz w:val="22"/>
+          <w:szCs w:val="22"/>
+        </w:rPr>
+        <w:t xml:space="preserve"> i2 =</w:t>
+      </w:r>
+      <w:proofErr w:type="spellStart"/>
+      <w:proofErr w:type="gramStart"/>
+      <w:r>
+        <w:rPr>
+          <w:rFonts w:ascii="Arial" w:hAnsi="Arial" w:cs="Arial"/>
+          <w:color w:val="0070C0"/>
+          <w:sz w:val="22"/>
+          <w:szCs w:val="22"/>
+        </w:rPr>
+        <w:t>SubInt</w:t>
+      </w:r>
+      <w:proofErr w:type="spellEnd"/>
+      <w:r>
+        <w:rPr>
+          <w:rFonts w:ascii="Arial" w:hAnsi="Arial" w:cs="Arial"/>
+          <w:color w:val="0070C0"/>
+          <w:sz w:val="22"/>
+          <w:szCs w:val="22"/>
+        </w:rPr>
+        <w:t>(</w:t>
+      </w:r>
+      <w:proofErr w:type="gramEnd"/>
+      <w:r>
+        <w:rPr>
+          <w:rFonts w:ascii="Arial" w:hAnsi="Arial" w:cs="Arial"/>
+          <w:color w:val="0070C0"/>
+          <w:sz w:val="22"/>
+          <w:szCs w:val="22"/>
+        </w:rPr>
+        <w:t xml:space="preserve">“29571”,2, </w:t>
+      </w:r>
+      <w:r>
+        <w:rPr>
+          <w:rFonts w:ascii="Arial" w:hAnsi="Arial" w:cs="Arial"/>
+          <w:color w:val="0070C0"/>
           <w:sz w:val="22"/>
           <w:szCs w:val="22"/>
         </w:rPr>
@@ -8540,58 +8512,470 @@
       <w:r>
         <w:rPr>
           <w:rFonts w:ascii="Arial" w:hAnsi="Arial" w:cs="Arial"/>
-          <w:sz w:val="22"/>
-          <w:szCs w:val="22"/>
-        </w:rPr>
-        <w:t>(atinge classes 1, 3, 5, 7:</w:t>
-      </w:r>
-      <w:r>
-        <w:rPr>
-          <w:rFonts w:ascii="Arial" w:hAnsi="Arial" w:cs="Arial"/>
-          <w:color w:val="FF0000"/>
-          <w:sz w:val="22"/>
-          <w:szCs w:val="22"/>
-        </w:rPr>
-        <w:t>L</w:t>
-      </w:r>
-      <w:r>
-        <w:rPr>
-          <w:rFonts w:ascii="Arial" w:hAnsi="Arial" w:cs="Arial"/>
-          <w:color w:val="FF0000"/>
-          <w:sz w:val="22"/>
-          <w:szCs w:val="22"/>
-        </w:rPr>
-        <w:t>SI</w:t>
-      </w:r>
-      <w:r>
-        <w:rPr>
-          <w:rFonts w:ascii="Arial" w:hAnsi="Arial" w:cs="Arial"/>
-          <w:sz w:val="22"/>
-          <w:szCs w:val="22"/>
-        </w:rPr>
-        <w:t>, 10:</w:t>
-      </w:r>
-      <w:r>
-        <w:rPr>
-          <w:rFonts w:ascii="Arial" w:hAnsi="Arial" w:cs="Arial"/>
-          <w:color w:val="FF0000"/>
-          <w:sz w:val="22"/>
-          <w:szCs w:val="22"/>
-        </w:rPr>
-        <w:t>L</w:t>
-      </w:r>
-      <w:r>
-        <w:rPr>
-          <w:rFonts w:ascii="Arial" w:hAnsi="Arial" w:cs="Arial"/>
-          <w:color w:val="FF0000"/>
-          <w:sz w:val="22"/>
-          <w:szCs w:val="22"/>
-        </w:rPr>
-        <w:t>II</w:t>
-      </w:r>
-      <w:r>
-        <w:rPr>
-          <w:rFonts w:ascii="Arial" w:hAnsi="Arial" w:cs="Arial"/>
+          <w:color w:val="0070C0"/>
+          <w:sz w:val="22"/>
+          <w:szCs w:val="22"/>
+        </w:rPr>
+        <w:t xml:space="preserve">); //deve retornar </w:t>
+      </w:r>
+      <w:r>
+        <w:rPr>
+          <w:rFonts w:ascii="Arial" w:hAnsi="Arial" w:cs="Arial"/>
+          <w:color w:val="0070C0"/>
+          <w:sz w:val="22"/>
+          <w:szCs w:val="22"/>
+        </w:rPr>
+        <w:t>5</w:t>
+      </w:r>
+    </w:p>
+    <w:p>
+      <w:pPr>
+        <w:pStyle w:val="PargrafodaLista"/>
+        <w:rPr>
+          <w:rFonts w:ascii="Arial" w:hAnsi="Arial" w:cs="Arial"/>
+          <w:color w:val="0070C0"/>
+          <w:sz w:val="22"/>
+          <w:szCs w:val="22"/>
+        </w:rPr>
+      </w:pPr>
+    </w:p>
+    <w:p>
+      <w:pPr>
+        <w:rPr>
+          <w:rFonts w:ascii="Arial" w:hAnsi="Arial" w:cs="Arial"/>
+          <w:color w:val="0070C0"/>
+          <w:sz w:val="22"/>
+          <w:szCs w:val="22"/>
+        </w:rPr>
+      </w:pPr>
+      <w:r>
+        <w:rPr>
+          <w:rFonts w:ascii="Arial" w:hAnsi="Arial" w:cs="Arial"/>
+          <w:color w:val="0070C0"/>
+          <w:sz w:val="22"/>
+          <w:szCs w:val="22"/>
+        </w:rPr>
+        <w:t>Casos de teste das classes inválidas: PARA CASA!!!!!</w:t>
+      </w:r>
+    </w:p>
+    <w:p>
+      <w:pPr>
+        <w:pStyle w:val="PargrafodaLista"/>
+        <w:numPr>
+          <w:ilvl w:val="0"/>
+          <w:numId w:val="6"/>
+        </w:numPr>
+        <w:rPr>
+          <w:rFonts w:ascii="Arial" w:hAnsi="Arial" w:cs="Arial"/>
+          <w:color w:val="0070C0"/>
+          <w:sz w:val="22"/>
+          <w:szCs w:val="22"/>
+        </w:rPr>
+      </w:pPr>
+      <w:r>
+        <w:rPr>
+          <w:rFonts w:ascii="Arial" w:hAnsi="Arial" w:cs="Arial"/>
+          <w:color w:val="0070C0"/>
+          <w:sz w:val="22"/>
+          <w:szCs w:val="22"/>
+        </w:rPr>
+        <w:t>CT3(atinge classe 2)</w:t>
+      </w:r>
+    </w:p>
+    <w:p>
+      <w:pPr>
+        <w:pStyle w:val="PargrafodaLista"/>
+        <w:rPr>
+          <w:rFonts w:ascii="Arial" w:hAnsi="Arial" w:cs="Arial"/>
+          <w:color w:val="0070C0"/>
+          <w:sz w:val="22"/>
+          <w:szCs w:val="22"/>
+        </w:rPr>
+      </w:pPr>
+      <w:proofErr w:type="spellStart"/>
+      <w:r>
+        <w:rPr>
+          <w:rFonts w:ascii="Arial" w:hAnsi="Arial" w:cs="Arial"/>
+          <w:color w:val="0070C0"/>
+          <w:sz w:val="22"/>
+          <w:szCs w:val="22"/>
+        </w:rPr>
+        <w:t>Int</w:t>
+      </w:r>
+      <w:proofErr w:type="spellEnd"/>
+      <w:r>
+        <w:rPr>
+          <w:rFonts w:ascii="Arial" w:hAnsi="Arial" w:cs="Arial"/>
+          <w:color w:val="0070C0"/>
+          <w:sz w:val="22"/>
+          <w:szCs w:val="22"/>
+        </w:rPr>
+        <w:t xml:space="preserve"> i3= </w:t>
+      </w:r>
+      <w:proofErr w:type="spellStart"/>
+      <w:proofErr w:type="gramStart"/>
+      <w:r>
+        <w:rPr>
+          <w:rFonts w:ascii="Arial" w:hAnsi="Arial" w:cs="Arial"/>
+          <w:color w:val="0070C0"/>
+          <w:sz w:val="22"/>
+          <w:szCs w:val="22"/>
+        </w:rPr>
+        <w:t>SubInt</w:t>
+      </w:r>
+      <w:proofErr w:type="spellEnd"/>
+      <w:r>
+        <w:rPr>
+          <w:rFonts w:ascii="Arial" w:hAnsi="Arial" w:cs="Arial"/>
+          <w:color w:val="0070C0"/>
+          <w:sz w:val="22"/>
+          <w:szCs w:val="22"/>
+        </w:rPr>
+        <w:t>(</w:t>
+      </w:r>
+      <w:proofErr w:type="gramEnd"/>
+      <w:r>
+        <w:rPr>
+          <w:rFonts w:ascii="Arial" w:hAnsi="Arial" w:cs="Arial"/>
+          <w:color w:val="0070C0"/>
+          <w:sz w:val="22"/>
+          <w:szCs w:val="22"/>
+        </w:rPr>
+        <w:t>“”, 0, 0);  //-1</w:t>
+      </w:r>
+    </w:p>
+    <w:p>
+      <w:pPr>
+        <w:pStyle w:val="PargrafodaLista"/>
+        <w:numPr>
+          <w:ilvl w:val="0"/>
+          <w:numId w:val="6"/>
+        </w:numPr>
+        <w:rPr>
+          <w:rFonts w:ascii="Arial" w:hAnsi="Arial" w:cs="Arial"/>
+          <w:color w:val="0070C0"/>
+          <w:sz w:val="22"/>
+          <w:szCs w:val="22"/>
+        </w:rPr>
+      </w:pPr>
+      <w:r>
+        <w:rPr>
+          <w:rFonts w:ascii="Arial" w:hAnsi="Arial" w:cs="Arial"/>
+          <w:color w:val="0070C0"/>
+          <w:sz w:val="22"/>
+          <w:szCs w:val="22"/>
+        </w:rPr>
+        <w:t>CT4(atinge classe 4)</w:t>
+      </w:r>
+    </w:p>
+    <w:p>
+      <w:pPr>
+        <w:pStyle w:val="PargrafodaLista"/>
+        <w:rPr>
+          <w:rFonts w:ascii="Arial" w:hAnsi="Arial" w:cs="Arial"/>
+          <w:color w:val="0070C0"/>
+          <w:sz w:val="22"/>
+          <w:szCs w:val="22"/>
+        </w:rPr>
+      </w:pPr>
+      <w:proofErr w:type="spellStart"/>
+      <w:r>
+        <w:rPr>
+          <w:rFonts w:ascii="Arial" w:hAnsi="Arial" w:cs="Arial"/>
+          <w:color w:val="0070C0"/>
+          <w:sz w:val="22"/>
+          <w:szCs w:val="22"/>
+        </w:rPr>
+        <w:t>Int</w:t>
+      </w:r>
+      <w:proofErr w:type="spellEnd"/>
+      <w:r>
+        <w:rPr>
+          <w:rFonts w:ascii="Arial" w:hAnsi="Arial" w:cs="Arial"/>
+          <w:color w:val="0070C0"/>
+          <w:sz w:val="22"/>
+          <w:szCs w:val="22"/>
+        </w:rPr>
+        <w:t xml:space="preserve"> i4= </w:t>
+      </w:r>
+      <w:proofErr w:type="spellStart"/>
+      <w:proofErr w:type="gramStart"/>
+      <w:r>
+        <w:rPr>
+          <w:rFonts w:ascii="Arial" w:hAnsi="Arial" w:cs="Arial"/>
+          <w:color w:val="0070C0"/>
+          <w:sz w:val="22"/>
+          <w:szCs w:val="22"/>
+        </w:rPr>
+        <w:t>SubInt</w:t>
+      </w:r>
+      <w:proofErr w:type="spellEnd"/>
+      <w:r>
+        <w:rPr>
+          <w:rFonts w:ascii="Arial" w:hAnsi="Arial" w:cs="Arial"/>
+          <w:color w:val="0070C0"/>
+          <w:sz w:val="22"/>
+          <w:szCs w:val="22"/>
+        </w:rPr>
+        <w:t>(</w:t>
+      </w:r>
+      <w:proofErr w:type="gramEnd"/>
+      <w:r>
+        <w:rPr>
+          <w:rFonts w:ascii="Arial" w:hAnsi="Arial" w:cs="Arial"/>
+          <w:color w:val="0070C0"/>
+          <w:sz w:val="22"/>
+          <w:szCs w:val="22"/>
+        </w:rPr>
+        <w:t>“</w:t>
+      </w:r>
+      <w:proofErr w:type="spellStart"/>
+      <w:r>
+        <w:rPr>
+          <w:rFonts w:ascii="Arial" w:hAnsi="Arial" w:cs="Arial"/>
+          <w:color w:val="0070C0"/>
+          <w:sz w:val="22"/>
+          <w:szCs w:val="22"/>
+        </w:rPr>
+        <w:t>null</w:t>
+      </w:r>
+      <w:proofErr w:type="spellEnd"/>
+      <w:r>
+        <w:rPr>
+          <w:rFonts w:ascii="Arial" w:hAnsi="Arial" w:cs="Arial"/>
+          <w:color w:val="0070C0"/>
+          <w:sz w:val="22"/>
+          <w:szCs w:val="22"/>
+        </w:rPr>
+        <w:t>”, 0,0); //-1</w:t>
+      </w:r>
+    </w:p>
+    <w:p>
+      <w:pPr>
+        <w:pStyle w:val="PargrafodaLista"/>
+        <w:numPr>
+          <w:ilvl w:val="0"/>
+          <w:numId w:val="6"/>
+        </w:numPr>
+        <w:rPr>
+          <w:rFonts w:ascii="Arial" w:hAnsi="Arial" w:cs="Arial"/>
+          <w:color w:val="0070C0"/>
+          <w:sz w:val="22"/>
+          <w:szCs w:val="22"/>
+        </w:rPr>
+      </w:pPr>
+      <w:r>
+        <w:rPr>
+          <w:rFonts w:ascii="Arial" w:hAnsi="Arial" w:cs="Arial"/>
+          <w:color w:val="0070C0"/>
+          <w:sz w:val="22"/>
+          <w:szCs w:val="22"/>
+        </w:rPr>
+        <w:t>CT5(atinge classe 6)</w:t>
+      </w:r>
+    </w:p>
+    <w:p>
+      <w:pPr>
+        <w:pStyle w:val="PargrafodaLista"/>
+        <w:rPr>
+          <w:rFonts w:ascii="Arial" w:hAnsi="Arial" w:cs="Arial"/>
+          <w:color w:val="0070C0"/>
+          <w:sz w:val="22"/>
+          <w:szCs w:val="22"/>
+        </w:rPr>
+      </w:pPr>
+      <w:proofErr w:type="spellStart"/>
+      <w:r>
+        <w:rPr>
+          <w:rFonts w:ascii="Arial" w:hAnsi="Arial" w:cs="Arial"/>
+          <w:color w:val="0070C0"/>
+          <w:sz w:val="22"/>
+          <w:szCs w:val="22"/>
+        </w:rPr>
+        <w:t>Int</w:t>
+      </w:r>
+      <w:proofErr w:type="spellEnd"/>
+      <w:r>
+        <w:rPr>
+          <w:rFonts w:ascii="Arial" w:hAnsi="Arial" w:cs="Arial"/>
+          <w:color w:val="0070C0"/>
+          <w:sz w:val="22"/>
+          <w:szCs w:val="22"/>
+        </w:rPr>
+        <w:t xml:space="preserve"> i5= </w:t>
+      </w:r>
+      <w:proofErr w:type="spellStart"/>
+      <w:proofErr w:type="gramStart"/>
+      <w:r>
+        <w:rPr>
+          <w:rFonts w:ascii="Arial" w:hAnsi="Arial" w:cs="Arial"/>
+          <w:color w:val="0070C0"/>
+          <w:sz w:val="22"/>
+          <w:szCs w:val="22"/>
+        </w:rPr>
+        <w:t>SubInt</w:t>
+      </w:r>
+      <w:proofErr w:type="spellEnd"/>
+      <w:r>
+        <w:rPr>
+          <w:rFonts w:ascii="Arial" w:hAnsi="Arial" w:cs="Arial"/>
+          <w:color w:val="0070C0"/>
+          <w:sz w:val="22"/>
+          <w:szCs w:val="22"/>
+        </w:rPr>
+        <w:t>(</w:t>
+      </w:r>
+      <w:proofErr w:type="gramEnd"/>
+      <w:r>
+        <w:rPr>
+          <w:rFonts w:ascii="Arial" w:hAnsi="Arial" w:cs="Arial"/>
+          <w:color w:val="0070C0"/>
+          <w:sz w:val="22"/>
+          <w:szCs w:val="22"/>
+        </w:rPr>
+        <w:t>“205</w:t>
+      </w:r>
+      <w:r>
+        <w:rPr>
+          <w:rFonts w:ascii="Arial" w:hAnsi="Arial" w:cs="Arial"/>
+          <w:color w:val="0070C0"/>
+          <w:sz w:val="22"/>
+          <w:szCs w:val="22"/>
+        </w:rPr>
+        <w:t>A</w:t>
+      </w:r>
+      <w:r>
+        <w:rPr>
+          <w:rFonts w:ascii="Arial" w:hAnsi="Arial" w:cs="Arial"/>
+          <w:color w:val="0070C0"/>
+          <w:sz w:val="22"/>
+          <w:szCs w:val="22"/>
+        </w:rPr>
+        <w:t>3”, 2 , 4); ///????</w:t>
+      </w:r>
+    </w:p>
+    <w:p>
+      <w:pPr>
+        <w:pStyle w:val="PargrafodaLista"/>
+        <w:numPr>
+          <w:ilvl w:val="0"/>
+          <w:numId w:val="6"/>
+        </w:numPr>
+        <w:rPr>
+          <w:rFonts w:ascii="Arial" w:hAnsi="Arial" w:cs="Arial"/>
+          <w:color w:val="0070C0"/>
+          <w:sz w:val="22"/>
+          <w:szCs w:val="22"/>
+        </w:rPr>
+      </w:pPr>
+      <w:r>
+        <w:rPr>
+          <w:rFonts w:ascii="Arial" w:hAnsi="Arial" w:cs="Arial"/>
+          <w:color w:val="0070C0"/>
+          <w:sz w:val="22"/>
+          <w:szCs w:val="22"/>
+        </w:rPr>
+        <w:t>CT6(atinge classe 8:LIE)</w:t>
+      </w:r>
+    </w:p>
+    <w:p>
+      <w:pPr>
+        <w:pStyle w:val="PargrafodaLista"/>
+        <w:rPr>
+          <w:rFonts w:ascii="Arial" w:hAnsi="Arial" w:cs="Arial"/>
+          <w:color w:val="0070C0"/>
+          <w:sz w:val="22"/>
+          <w:szCs w:val="22"/>
+        </w:rPr>
+      </w:pPr>
+      <w:proofErr w:type="spellStart"/>
+      <w:r>
+        <w:rPr>
+          <w:rFonts w:ascii="Arial" w:hAnsi="Arial" w:cs="Arial"/>
+          <w:color w:val="0070C0"/>
+          <w:sz w:val="22"/>
+          <w:szCs w:val="22"/>
+        </w:rPr>
+        <w:t>Int</w:t>
+      </w:r>
+      <w:proofErr w:type="spellEnd"/>
+      <w:r>
+        <w:rPr>
+          <w:rFonts w:ascii="Arial" w:hAnsi="Arial" w:cs="Arial"/>
+          <w:color w:val="0070C0"/>
+          <w:sz w:val="22"/>
+          <w:szCs w:val="22"/>
+        </w:rPr>
+        <w:t xml:space="preserve"> i6=</w:t>
+      </w:r>
+      <w:proofErr w:type="spellStart"/>
+      <w:proofErr w:type="gramStart"/>
+      <w:r>
+        <w:rPr>
+          <w:rFonts w:ascii="Arial" w:hAnsi="Arial" w:cs="Arial"/>
+          <w:color w:val="0070C0"/>
+          <w:sz w:val="22"/>
+          <w:szCs w:val="22"/>
+        </w:rPr>
+        <w:t>SubInt</w:t>
+      </w:r>
+      <w:proofErr w:type="spellEnd"/>
+      <w:r>
+        <w:rPr>
+          <w:rFonts w:ascii="Arial" w:hAnsi="Arial" w:cs="Arial"/>
+          <w:color w:val="0070C0"/>
+          <w:sz w:val="22"/>
+          <w:szCs w:val="22"/>
+        </w:rPr>
+        <w:t>(</w:t>
+      </w:r>
+      <w:proofErr w:type="gramEnd"/>
+      <w:r>
+        <w:rPr>
+          <w:rFonts w:ascii="Arial" w:hAnsi="Arial" w:cs="Arial"/>
+          <w:color w:val="0070C0"/>
+          <w:sz w:val="22"/>
+          <w:szCs w:val="22"/>
+        </w:rPr>
+        <w:t>“123427”, -1, 2);</w:t>
+      </w:r>
+    </w:p>
+    <w:p>
+      <w:pPr>
+        <w:pStyle w:val="PargrafodaLista"/>
+        <w:numPr>
+          <w:ilvl w:val="0"/>
+          <w:numId w:val="6"/>
+        </w:numPr>
+        <w:rPr>
+          <w:rFonts w:ascii="Arial" w:hAnsi="Arial" w:cs="Arial"/>
+          <w:color w:val="0070C0"/>
+          <w:sz w:val="22"/>
+          <w:szCs w:val="22"/>
+        </w:rPr>
+      </w:pPr>
+      <w:r>
+        <w:rPr>
+          <w:rFonts w:ascii="Arial" w:hAnsi="Arial" w:cs="Arial"/>
+          <w:color w:val="0070C0"/>
+          <w:sz w:val="22"/>
+          <w:szCs w:val="22"/>
+        </w:rPr>
+        <w:t>CT7(atinge classe 9</w:t>
+      </w:r>
+      <w:r>
+        <w:rPr>
+          <w:rFonts w:ascii="Arial" w:hAnsi="Arial" w:cs="Arial"/>
+          <w:color w:val="0070C0"/>
+          <w:sz w:val="22"/>
+          <w:szCs w:val="22"/>
+        </w:rPr>
+        <w:t>:LSE</w:t>
+      </w:r>
+      <w:r>
+        <w:rPr>
+          <w:rFonts w:ascii="Arial" w:hAnsi="Arial" w:cs="Arial"/>
+          <w:color w:val="0070C0"/>
           <w:sz w:val="22"/>
           <w:szCs w:val="22"/>
         </w:rPr>
@@ -8603,14 +8987,16 @@
         <w:pStyle w:val="PargrafodaLista"/>
         <w:rPr>
           <w:rFonts w:ascii="Arial" w:hAnsi="Arial" w:cs="Arial"/>
-          <w:sz w:val="22"/>
-          <w:szCs w:val="22"/>
-        </w:rPr>
-      </w:pPr>
-      <w:proofErr w:type="spellStart"/>
-      <w:r>
-        <w:rPr>
-          <w:rFonts w:ascii="Arial" w:hAnsi="Arial" w:cs="Arial"/>
+          <w:color w:val="0070C0"/>
+          <w:sz w:val="22"/>
+          <w:szCs w:val="22"/>
+        </w:rPr>
+      </w:pPr>
+      <w:proofErr w:type="spellStart"/>
+      <w:r>
+        <w:rPr>
+          <w:rFonts w:ascii="Arial" w:hAnsi="Arial" w:cs="Arial"/>
+          <w:color w:val="0070C0"/>
           <w:sz w:val="22"/>
           <w:szCs w:val="22"/>
         </w:rPr>
@@ -8620,32 +9006,18 @@
       <w:r>
         <w:rPr>
           <w:rFonts w:ascii="Arial" w:hAnsi="Arial" w:cs="Arial"/>
-          <w:sz w:val="22"/>
-          <w:szCs w:val="22"/>
-        </w:rPr>
-        <w:t xml:space="preserve"> i</w:t>
-      </w:r>
-      <w:r>
-        <w:rPr>
-          <w:rFonts w:ascii="Arial" w:hAnsi="Arial" w:cs="Arial"/>
-          <w:sz w:val="22"/>
-          <w:szCs w:val="22"/>
-        </w:rPr>
-        <w:t>2</w:t>
-      </w:r>
-      <w:r>
-        <w:rPr>
-          <w:rFonts w:ascii="Arial" w:hAnsi="Arial" w:cs="Arial"/>
-          <w:sz w:val="22"/>
-          <w:szCs w:val="22"/>
-        </w:rPr>
-        <w:t xml:space="preserve"> =</w:t>
+          <w:color w:val="0070C0"/>
+          <w:sz w:val="22"/>
+          <w:szCs w:val="22"/>
+        </w:rPr>
+        <w:t xml:space="preserve"> i7= </w:t>
       </w:r>
       <w:proofErr w:type="spellStart"/>
       <w:proofErr w:type="gramStart"/>
       <w:r>
         <w:rPr>
           <w:rFonts w:ascii="Arial" w:hAnsi="Arial" w:cs="Arial"/>
+          <w:color w:val="0070C0"/>
           <w:sz w:val="22"/>
           <w:szCs w:val="22"/>
         </w:rPr>
@@ -8655,6 +9027,7 @@
       <w:r>
         <w:rPr>
           <w:rFonts w:ascii="Arial" w:hAnsi="Arial" w:cs="Arial"/>
+          <w:color w:val="0070C0"/>
           <w:sz w:val="22"/>
           <w:szCs w:val="22"/>
         </w:rPr>
@@ -8664,90 +9037,206 @@
       <w:r>
         <w:rPr>
           <w:rFonts w:ascii="Arial" w:hAnsi="Arial" w:cs="Arial"/>
-          <w:sz w:val="22"/>
-          <w:szCs w:val="22"/>
-        </w:rPr>
-        <w:t>“29571”,</w:t>
-      </w:r>
-      <w:r>
-        <w:rPr>
-          <w:rFonts w:ascii="Arial" w:hAnsi="Arial" w:cs="Arial"/>
-          <w:color w:val="FF0000"/>
-          <w:sz w:val="22"/>
-          <w:szCs w:val="22"/>
-        </w:rPr>
-        <w:t>2</w:t>
-      </w:r>
-      <w:r>
-        <w:rPr>
-          <w:rFonts w:ascii="Arial" w:hAnsi="Arial" w:cs="Arial"/>
-          <w:sz w:val="22"/>
-          <w:szCs w:val="22"/>
-        </w:rPr>
-        <w:t xml:space="preserve">, </w:t>
-      </w:r>
-      <w:r>
-        <w:rPr>
-          <w:rFonts w:ascii="Arial" w:hAnsi="Arial" w:cs="Arial"/>
-          <w:color w:val="FF0000"/>
-          <w:sz w:val="22"/>
-          <w:szCs w:val="22"/>
-        </w:rPr>
-        <w:t>2</w:t>
-      </w:r>
-      <w:r>
-        <w:rPr>
-          <w:rFonts w:ascii="Arial" w:hAnsi="Arial" w:cs="Arial"/>
-          <w:sz w:val="22"/>
-          <w:szCs w:val="22"/>
-        </w:rPr>
-        <w:t xml:space="preserve">); //deve retornar </w:t>
-      </w:r>
-      <w:r>
-        <w:rPr>
-          <w:rFonts w:ascii="Arial" w:hAnsi="Arial" w:cs="Arial"/>
-          <w:sz w:val="22"/>
-          <w:szCs w:val="22"/>
-        </w:rPr>
-        <w:t>5</w:t>
+          <w:color w:val="0070C0"/>
+          <w:sz w:val="22"/>
+          <w:szCs w:val="22"/>
+        </w:rPr>
+        <w:t>“345664”, 4, 3); //-1</w:t>
       </w:r>
     </w:p>
     <w:p>
       <w:pPr>
         <w:pStyle w:val="PargrafodaLista"/>
-        <w:rPr>
-          <w:rFonts w:ascii="Arial" w:hAnsi="Arial" w:cs="Arial"/>
-          <w:sz w:val="22"/>
-          <w:szCs w:val="22"/>
-        </w:rPr>
-      </w:pPr>
-    </w:p>
-    <w:p>
-      <w:pPr>
-        <w:rPr>
-          <w:rFonts w:ascii="Arial" w:hAnsi="Arial" w:cs="Arial"/>
-          <w:sz w:val="22"/>
-          <w:szCs w:val="22"/>
-          <w:u w:val="single"/>
-        </w:rPr>
-      </w:pPr>
-      <w:r>
-        <w:rPr>
-          <w:rFonts w:ascii="Arial" w:hAnsi="Arial" w:cs="Arial"/>
-          <w:sz w:val="22"/>
-          <w:szCs w:val="22"/>
-        </w:rPr>
-        <w:t xml:space="preserve">Casos de teste das classes inválidas: </w:t>
-      </w:r>
-      <w:r>
-        <w:rPr>
-          <w:rFonts w:ascii="Arial" w:hAnsi="Arial" w:cs="Arial"/>
-          <w:color w:val="FF0000"/>
-          <w:sz w:val="22"/>
-          <w:szCs w:val="22"/>
-        </w:rPr>
-        <w:t>PARA CASA!!!!!</w:t>
-      </w:r>
+        <w:numPr>
+          <w:ilvl w:val="0"/>
+          <w:numId w:val="6"/>
+        </w:numPr>
+        <w:rPr>
+          <w:rFonts w:ascii="Arial" w:hAnsi="Arial" w:cs="Arial"/>
+          <w:color w:val="0070C0"/>
+          <w:sz w:val="22"/>
+          <w:szCs w:val="22"/>
+        </w:rPr>
+      </w:pPr>
+      <w:r>
+        <w:rPr>
+          <w:rFonts w:ascii="Arial" w:hAnsi="Arial" w:cs="Arial"/>
+          <w:color w:val="0070C0"/>
+          <w:sz w:val="22"/>
+          <w:szCs w:val="22"/>
+        </w:rPr>
+        <w:t>CT8(atinge classe 11:LIE)</w:t>
+      </w:r>
+    </w:p>
+    <w:p>
+      <w:pPr>
+        <w:pStyle w:val="PargrafodaLista"/>
+        <w:rPr>
+          <w:rFonts w:ascii="Arial" w:hAnsi="Arial" w:cs="Arial"/>
+          <w:color w:val="0070C0"/>
+          <w:sz w:val="22"/>
+          <w:szCs w:val="22"/>
+        </w:rPr>
+      </w:pPr>
+      <w:proofErr w:type="spellStart"/>
+      <w:r>
+        <w:rPr>
+          <w:rFonts w:ascii="Arial" w:hAnsi="Arial" w:cs="Arial"/>
+          <w:color w:val="0070C0"/>
+          <w:sz w:val="22"/>
+          <w:szCs w:val="22"/>
+        </w:rPr>
+        <w:t>Int</w:t>
+      </w:r>
+      <w:proofErr w:type="spellEnd"/>
+      <w:r>
+        <w:rPr>
+          <w:rFonts w:ascii="Arial" w:hAnsi="Arial" w:cs="Arial"/>
+          <w:color w:val="0070C0"/>
+          <w:sz w:val="22"/>
+          <w:szCs w:val="22"/>
+        </w:rPr>
+        <w:t xml:space="preserve"> i8= </w:t>
+      </w:r>
+      <w:proofErr w:type="spellStart"/>
+      <w:proofErr w:type="gramStart"/>
+      <w:r>
+        <w:rPr>
+          <w:rFonts w:ascii="Arial" w:hAnsi="Arial" w:cs="Arial"/>
+          <w:color w:val="0070C0"/>
+          <w:sz w:val="22"/>
+          <w:szCs w:val="22"/>
+        </w:rPr>
+        <w:t>SubInt</w:t>
+      </w:r>
+      <w:proofErr w:type="spellEnd"/>
+      <w:r>
+        <w:rPr>
+          <w:rFonts w:ascii="Arial" w:hAnsi="Arial" w:cs="Arial"/>
+          <w:color w:val="0070C0"/>
+          <w:sz w:val="22"/>
+          <w:szCs w:val="22"/>
+        </w:rPr>
+        <w:t>(</w:t>
+      </w:r>
+      <w:proofErr w:type="gramEnd"/>
+      <w:r>
+        <w:rPr>
+          <w:rFonts w:ascii="Arial" w:hAnsi="Arial" w:cs="Arial"/>
+          <w:color w:val="0070C0"/>
+          <w:sz w:val="22"/>
+          <w:szCs w:val="22"/>
+        </w:rPr>
+        <w:t>“23432”, 3, 2);// -1</w:t>
+      </w:r>
+    </w:p>
+    <w:p>
+      <w:pPr>
+        <w:pStyle w:val="PargrafodaLista"/>
+        <w:numPr>
+          <w:ilvl w:val="0"/>
+          <w:numId w:val="6"/>
+        </w:numPr>
+        <w:rPr>
+          <w:rFonts w:ascii="Arial" w:hAnsi="Arial" w:cs="Arial"/>
+          <w:color w:val="0070C0"/>
+          <w:sz w:val="22"/>
+          <w:szCs w:val="22"/>
+        </w:rPr>
+      </w:pPr>
+      <w:r>
+        <w:rPr>
+          <w:rFonts w:ascii="Arial" w:hAnsi="Arial" w:cs="Arial"/>
+          <w:color w:val="0070C0"/>
+          <w:sz w:val="22"/>
+          <w:szCs w:val="22"/>
+        </w:rPr>
+        <w:t>CT9(atinge classe 12:LSE)</w:t>
+      </w:r>
+    </w:p>
+    <w:p>
+      <w:pPr>
+        <w:pStyle w:val="PargrafodaLista"/>
+        <w:rPr>
+          <w:rFonts w:ascii="Arial" w:hAnsi="Arial" w:cs="Arial"/>
+          <w:color w:val="0070C0"/>
+          <w:sz w:val="22"/>
+          <w:szCs w:val="22"/>
+        </w:rPr>
+      </w:pPr>
+      <w:proofErr w:type="spellStart"/>
+      <w:r>
+        <w:rPr>
+          <w:rFonts w:ascii="Arial" w:hAnsi="Arial" w:cs="Arial"/>
+          <w:color w:val="0070C0"/>
+          <w:sz w:val="22"/>
+          <w:szCs w:val="22"/>
+        </w:rPr>
+        <w:t>Int</w:t>
+      </w:r>
+      <w:proofErr w:type="spellEnd"/>
+      <w:r>
+        <w:rPr>
+          <w:rFonts w:ascii="Arial" w:hAnsi="Arial" w:cs="Arial"/>
+          <w:color w:val="0070C0"/>
+          <w:sz w:val="22"/>
+          <w:szCs w:val="22"/>
+        </w:rPr>
+        <w:t xml:space="preserve"> i9=</w:t>
+      </w:r>
+      <w:proofErr w:type="spellStart"/>
+      <w:proofErr w:type="gramStart"/>
+      <w:r>
+        <w:rPr>
+          <w:rFonts w:ascii="Arial" w:hAnsi="Arial" w:cs="Arial"/>
+          <w:color w:val="0070C0"/>
+          <w:sz w:val="22"/>
+          <w:szCs w:val="22"/>
+        </w:rPr>
+        <w:t>SubInt</w:t>
+      </w:r>
+      <w:proofErr w:type="spellEnd"/>
+      <w:r>
+        <w:rPr>
+          <w:rFonts w:ascii="Arial" w:hAnsi="Arial" w:cs="Arial"/>
+          <w:color w:val="0070C0"/>
+          <w:sz w:val="22"/>
+          <w:szCs w:val="22"/>
+        </w:rPr>
+        <w:t>(</w:t>
+      </w:r>
+      <w:proofErr w:type="gramEnd"/>
+      <w:r>
+        <w:rPr>
+          <w:rFonts w:ascii="Arial" w:hAnsi="Arial" w:cs="Arial"/>
+          <w:color w:val="0070C0"/>
+          <w:sz w:val="22"/>
+          <w:szCs w:val="22"/>
+        </w:rPr>
+        <w:t>“56544”, 3, 5);// -1</w:t>
+      </w:r>
+    </w:p>
+    <w:p>
+      <w:pPr>
+        <w:pStyle w:val="PargrafodaLista"/>
+        <w:rPr>
+          <w:rFonts w:ascii="Arial" w:hAnsi="Arial" w:cs="Arial"/>
+          <w:color w:val="0070C0"/>
+          <w:sz w:val="22"/>
+          <w:szCs w:val="22"/>
+        </w:rPr>
+      </w:pPr>
+    </w:p>
+    <w:p>
+      <w:pPr>
+        <w:pStyle w:val="PargrafodaLista"/>
+        <w:rPr>
+          <w:rFonts w:ascii="Arial" w:hAnsi="Arial" w:cs="Arial"/>
+          <w:color w:val="0070C0"/>
+          <w:sz w:val="22"/>
+          <w:szCs w:val="22"/>
+        </w:rPr>
+      </w:pPr>
     </w:p>
     <w:p>
       <w:pPr>
@@ -8786,6 +9275,7 @@
           <w:sz w:val="22"/>
           <w:szCs w:val="22"/>
         </w:rPr>
+        <w:lastRenderedPageBreak/>
         <w:t>5</w:t>
       </w:r>
       <w:r>
@@ -9328,23 +9818,7 @@
                 <w:sz w:val="22"/>
                 <w:szCs w:val="22"/>
               </w:rPr>
-              <w:t>{alfanuméricos} – {</w:t>
-            </w:r>
-            <w:r>
-              <w:rPr>
-                <w:rFonts w:ascii="Arial" w:hAnsi="Arial" w:cs="Arial"/>
-                <w:sz w:val="22"/>
-                <w:szCs w:val="22"/>
-              </w:rPr>
-              <w:t>"|", "!", "$","&amp;", ";", "&lt;" e "&gt;".</w:t>
-            </w:r>
-            <w:r>
-              <w:rPr>
-                <w:rFonts w:ascii="Arial" w:hAnsi="Arial" w:cs="Arial"/>
-                <w:sz w:val="22"/>
-                <w:szCs w:val="22"/>
-              </w:rPr>
-              <w:t>} (6)</w:t>
+              <w:t>{alfanuméricos} – {"|", "!", "$","&amp;", ";", "&lt;" e "&gt;".} (6)</w:t>
             </w:r>
           </w:p>
         </w:tc>
@@ -9401,7 +9875,6 @@
                 <w:sz w:val="22"/>
                 <w:szCs w:val="22"/>
               </w:rPr>
-              <w:lastRenderedPageBreak/>
               <w:t xml:space="preserve">Arquivo da origem </w:t>
             </w:r>
             <w:proofErr w:type="gramStart"/>
@@ -9892,9 +10365,27 @@
           <w:sz w:val="22"/>
           <w:szCs w:val="22"/>
         </w:rPr>
-        <w:t>cat</w:t>
-      </w:r>
-      <w:proofErr w:type="spellEnd"/>
+        <w:t>c</w:t>
+      </w:r>
+      <w:r>
+        <w:rPr>
+          <w:rFonts w:ascii="Arial" w:hAnsi="Arial" w:cs="Arial"/>
+          <w:color w:val="0070C0"/>
+          <w:sz w:val="22"/>
+          <w:szCs w:val="22"/>
+        </w:rPr>
+        <w:t>at</w:t>
+      </w:r>
+      <w:proofErr w:type="spellEnd"/>
+      <w:r>
+        <w:rPr>
+          <w:rFonts w:ascii="Arial" w:hAnsi="Arial" w:cs="Arial"/>
+          <w:color w:val="0070C0"/>
+          <w:sz w:val="22"/>
+          <w:szCs w:val="22"/>
+        </w:rPr>
+        <w:t xml:space="preserve"> </w:t>
+      </w:r>
     </w:p>
     <w:p>
       <w:pPr>
@@ -9924,27 +10415,7 @@
           <w:sz w:val="22"/>
           <w:szCs w:val="22"/>
         </w:rPr>
-        <w:t xml:space="preserve">: O </w:t>
-      </w:r>
-      <w:proofErr w:type="gramStart"/>
-      <w:r>
-        <w:rPr>
-          <w:rFonts w:ascii="Arial" w:hAnsi="Arial" w:cs="Arial"/>
-          <w:color w:val="0070C0"/>
-          <w:sz w:val="22"/>
-          <w:szCs w:val="22"/>
-        </w:rPr>
-        <w:t>enunciado não específica</w:t>
-      </w:r>
-      <w:proofErr w:type="gramEnd"/>
-      <w:r>
-        <w:rPr>
-          <w:rFonts w:ascii="Arial" w:hAnsi="Arial" w:cs="Arial"/>
-          <w:color w:val="0070C0"/>
-          <w:sz w:val="22"/>
-          <w:szCs w:val="22"/>
-        </w:rPr>
-        <w:t xml:space="preserve"> o que deve ocorrer.</w:t>
+        <w:t>: O enunciado não específica o que deve ocorrer.</w:t>
       </w:r>
     </w:p>
     <w:p>
@@ -9968,17 +10439,345 @@
           <w:sz w:val="22"/>
           <w:szCs w:val="22"/>
         </w:rPr>
-        <w:t xml:space="preserve">Demais casos de teste: </w:t>
-      </w:r>
-      <w:r>
-        <w:rPr>
-          <w:rFonts w:ascii="Arial" w:hAnsi="Arial" w:cs="Arial"/>
-          <w:color w:val="FF0000"/>
-          <w:sz w:val="22"/>
-          <w:szCs w:val="22"/>
-        </w:rPr>
-        <w:t>PARA CASA</w:t>
-      </w:r>
+        <w:t>CT4(atinge classe 4)</w:t>
+      </w:r>
+    </w:p>
+    <w:p>
+      <w:pPr>
+        <w:pStyle w:val="PargrafodaLista"/>
+        <w:rPr>
+          <w:rFonts w:ascii="Arial" w:hAnsi="Arial" w:cs="Arial"/>
+          <w:color w:val="0070C0"/>
+          <w:sz w:val="22"/>
+          <w:szCs w:val="22"/>
+        </w:rPr>
+      </w:pPr>
+      <w:proofErr w:type="spellStart"/>
+      <w:r>
+        <w:rPr>
+          <w:rFonts w:ascii="Arial" w:hAnsi="Arial" w:cs="Arial"/>
+          <w:color w:val="0070C0"/>
+          <w:sz w:val="22"/>
+          <w:szCs w:val="22"/>
+        </w:rPr>
+        <w:t>cat</w:t>
+      </w:r>
+      <w:proofErr w:type="spellEnd"/>
+      <w:r>
+        <w:rPr>
+          <w:rFonts w:ascii="Arial" w:hAnsi="Arial" w:cs="Arial"/>
+          <w:color w:val="0070C0"/>
+          <w:sz w:val="22"/>
+          <w:szCs w:val="22"/>
+        </w:rPr>
+        <w:t xml:space="preserve"> “”</w:t>
+      </w:r>
+    </w:p>
+    <w:p>
+      <w:pPr>
+        <w:pStyle w:val="PargrafodaLista"/>
+        <w:rPr>
+          <w:rFonts w:ascii="Arial" w:hAnsi="Arial" w:cs="Arial"/>
+          <w:color w:val="0070C0"/>
+          <w:sz w:val="22"/>
+          <w:szCs w:val="22"/>
+        </w:rPr>
+      </w:pPr>
+      <w:r>
+        <w:rPr>
+          <w:rFonts w:ascii="Arial" w:hAnsi="Arial" w:cs="Arial"/>
+          <w:color w:val="0070C0"/>
+          <w:sz w:val="22"/>
+          <w:szCs w:val="22"/>
+        </w:rPr>
+        <w:t>OBS: O enunciado não específica o que deve ocorrer.</w:t>
+      </w:r>
+    </w:p>
+    <w:p>
+      <w:pPr>
+        <w:pStyle w:val="PargrafodaLista"/>
+        <w:numPr>
+          <w:ilvl w:val="0"/>
+          <w:numId w:val="6"/>
+        </w:numPr>
+        <w:rPr>
+          <w:rFonts w:ascii="Arial" w:hAnsi="Arial" w:cs="Arial"/>
+          <w:color w:val="0070C0"/>
+          <w:sz w:val="22"/>
+          <w:szCs w:val="22"/>
+        </w:rPr>
+      </w:pPr>
+      <w:r>
+        <w:rPr>
+          <w:rFonts w:ascii="Arial" w:hAnsi="Arial" w:cs="Arial"/>
+          <w:color w:val="0070C0"/>
+          <w:sz w:val="22"/>
+          <w:szCs w:val="22"/>
+        </w:rPr>
+        <w:t>CT5(atinge classe 5:LSE)</w:t>
+      </w:r>
+    </w:p>
+    <w:p>
+      <w:pPr>
+        <w:pStyle w:val="PargrafodaLista"/>
+        <w:rPr>
+          <w:rFonts w:ascii="Arial" w:hAnsi="Arial" w:cs="Arial"/>
+          <w:color w:val="0070C0"/>
+          <w:sz w:val="22"/>
+          <w:szCs w:val="22"/>
+        </w:rPr>
+      </w:pPr>
+      <w:proofErr w:type="spellStart"/>
+      <w:r>
+        <w:rPr>
+          <w:rFonts w:ascii="Arial" w:hAnsi="Arial" w:cs="Arial"/>
+          <w:color w:val="0070C0"/>
+          <w:sz w:val="22"/>
+          <w:szCs w:val="22"/>
+        </w:rPr>
+        <w:t>cat</w:t>
+      </w:r>
+      <w:proofErr w:type="spellEnd"/>
+      <w:r>
+        <w:rPr>
+          <w:rFonts w:ascii="Arial" w:hAnsi="Arial" w:cs="Arial"/>
+          <w:color w:val="0070C0"/>
+          <w:sz w:val="22"/>
+          <w:szCs w:val="22"/>
+        </w:rPr>
+        <w:t xml:space="preserve"> arquivo0001</w:t>
+      </w:r>
+    </w:p>
+    <w:p>
+      <w:pPr>
+        <w:pStyle w:val="PargrafodaLista"/>
+        <w:rPr>
+          <w:rFonts w:ascii="Arial" w:hAnsi="Arial" w:cs="Arial"/>
+          <w:color w:val="0070C0"/>
+          <w:sz w:val="22"/>
+          <w:szCs w:val="22"/>
+        </w:rPr>
+      </w:pPr>
+      <w:r>
+        <w:rPr>
+          <w:rFonts w:ascii="Arial" w:hAnsi="Arial" w:cs="Arial"/>
+          <w:color w:val="0070C0"/>
+          <w:sz w:val="22"/>
+          <w:szCs w:val="22"/>
+        </w:rPr>
+        <w:t xml:space="preserve">OBS: O </w:t>
+      </w:r>
+      <w:proofErr w:type="gramStart"/>
+      <w:r>
+        <w:rPr>
+          <w:rFonts w:ascii="Arial" w:hAnsi="Arial" w:cs="Arial"/>
+          <w:color w:val="0070C0"/>
+          <w:sz w:val="22"/>
+          <w:szCs w:val="22"/>
+        </w:rPr>
+        <w:t>enunciado não específica</w:t>
+      </w:r>
+      <w:proofErr w:type="gramEnd"/>
+      <w:r>
+        <w:rPr>
+          <w:rFonts w:ascii="Arial" w:hAnsi="Arial" w:cs="Arial"/>
+          <w:color w:val="0070C0"/>
+          <w:sz w:val="22"/>
+          <w:szCs w:val="22"/>
+        </w:rPr>
+        <w:t xml:space="preserve"> o que deve ocorrer.</w:t>
+      </w:r>
+    </w:p>
+    <w:p>
+      <w:pPr>
+        <w:pStyle w:val="PargrafodaLista"/>
+        <w:numPr>
+          <w:ilvl w:val="0"/>
+          <w:numId w:val="6"/>
+        </w:numPr>
+        <w:rPr>
+          <w:rFonts w:ascii="Arial" w:hAnsi="Arial" w:cs="Arial"/>
+          <w:color w:val="0070C0"/>
+          <w:sz w:val="22"/>
+          <w:szCs w:val="22"/>
+        </w:rPr>
+      </w:pPr>
+      <w:r>
+        <w:rPr>
+          <w:rFonts w:ascii="Arial" w:hAnsi="Arial" w:cs="Arial"/>
+          <w:color w:val="0070C0"/>
+          <w:sz w:val="22"/>
+          <w:szCs w:val="22"/>
+        </w:rPr>
+        <w:t>CT6(atinge classe 7)</w:t>
+      </w:r>
+    </w:p>
+    <w:p>
+      <w:pPr>
+        <w:pStyle w:val="PargrafodaLista"/>
+        <w:rPr>
+          <w:rFonts w:ascii="Arial" w:hAnsi="Arial" w:cs="Arial"/>
+          <w:color w:val="0070C0"/>
+          <w:sz w:val="22"/>
+          <w:szCs w:val="22"/>
+        </w:rPr>
+      </w:pPr>
+      <w:proofErr w:type="spellStart"/>
+      <w:r>
+        <w:rPr>
+          <w:rFonts w:ascii="Arial" w:hAnsi="Arial" w:cs="Arial"/>
+          <w:color w:val="0070C0"/>
+          <w:sz w:val="22"/>
+          <w:szCs w:val="22"/>
+        </w:rPr>
+        <w:t>cat</w:t>
+      </w:r>
+      <w:proofErr w:type="spellEnd"/>
+      <w:r>
+        <w:rPr>
+          <w:rFonts w:ascii="Arial" w:hAnsi="Arial" w:cs="Arial"/>
+          <w:color w:val="0070C0"/>
+          <w:sz w:val="22"/>
+          <w:szCs w:val="22"/>
+        </w:rPr>
+        <w:t xml:space="preserve"> arq$1</w:t>
+      </w:r>
+    </w:p>
+    <w:p>
+      <w:pPr>
+        <w:pStyle w:val="PargrafodaLista"/>
+        <w:rPr>
+          <w:rFonts w:ascii="Arial" w:hAnsi="Arial" w:cs="Arial"/>
+          <w:color w:val="0070C0"/>
+          <w:sz w:val="22"/>
+          <w:szCs w:val="22"/>
+        </w:rPr>
+      </w:pPr>
+      <w:r>
+        <w:rPr>
+          <w:rFonts w:ascii="Arial" w:hAnsi="Arial" w:cs="Arial"/>
+          <w:color w:val="0070C0"/>
+          <w:sz w:val="22"/>
+          <w:szCs w:val="22"/>
+        </w:rPr>
+        <w:t>OBS: O enunciado não específica o que deve ocorrer.</w:t>
+      </w:r>
+    </w:p>
+    <w:p>
+      <w:pPr>
+        <w:pStyle w:val="PargrafodaLista"/>
+        <w:numPr>
+          <w:ilvl w:val="0"/>
+          <w:numId w:val="6"/>
+        </w:numPr>
+        <w:rPr>
+          <w:rFonts w:ascii="Arial" w:hAnsi="Arial" w:cs="Arial"/>
+          <w:color w:val="0070C0"/>
+          <w:sz w:val="22"/>
+          <w:szCs w:val="22"/>
+        </w:rPr>
+      </w:pPr>
+      <w:r>
+        <w:rPr>
+          <w:rFonts w:ascii="Arial" w:hAnsi="Arial" w:cs="Arial"/>
+          <w:color w:val="0070C0"/>
+          <w:sz w:val="22"/>
+          <w:szCs w:val="22"/>
+        </w:rPr>
+        <w:t>CT7(atinge classe 9)</w:t>
+      </w:r>
+    </w:p>
+    <w:p>
+      <w:pPr>
+        <w:pStyle w:val="PargrafodaLista"/>
+        <w:rPr>
+          <w:rFonts w:ascii="Arial" w:hAnsi="Arial" w:cs="Arial"/>
+          <w:color w:val="0070C0"/>
+          <w:sz w:val="22"/>
+          <w:szCs w:val="22"/>
+        </w:rPr>
+      </w:pPr>
+      <w:proofErr w:type="spellStart"/>
+      <w:r>
+        <w:rPr>
+          <w:rFonts w:ascii="Arial" w:hAnsi="Arial" w:cs="Arial"/>
+          <w:color w:val="0070C0"/>
+          <w:sz w:val="22"/>
+          <w:szCs w:val="22"/>
+        </w:rPr>
+        <w:t>cat</w:t>
+      </w:r>
+      <w:proofErr w:type="spellEnd"/>
+      <w:r>
+        <w:rPr>
+          <w:rFonts w:ascii="Arial" w:hAnsi="Arial" w:cs="Arial"/>
+          <w:color w:val="0070C0"/>
+          <w:sz w:val="22"/>
+          <w:szCs w:val="22"/>
+        </w:rPr>
+        <w:t xml:space="preserve"> arq1</w:t>
+      </w:r>
+    </w:p>
+    <w:p>
+      <w:pPr>
+        <w:pStyle w:val="PargrafodaLista"/>
+        <w:rPr>
+          <w:rFonts w:ascii="Arial" w:hAnsi="Arial" w:cs="Arial"/>
+          <w:color w:val="0070C0"/>
+          <w:sz w:val="22"/>
+          <w:szCs w:val="22"/>
+        </w:rPr>
+      </w:pPr>
+      <w:proofErr w:type="spellStart"/>
+      <w:r>
+        <w:rPr>
+          <w:rFonts w:ascii="Arial" w:hAnsi="Arial" w:cs="Arial"/>
+          <w:color w:val="0070C0"/>
+          <w:sz w:val="22"/>
+          <w:szCs w:val="22"/>
+        </w:rPr>
+        <w:t>Obs</w:t>
+      </w:r>
+      <w:proofErr w:type="spellEnd"/>
+      <w:r>
+        <w:rPr>
+          <w:rFonts w:ascii="Arial" w:hAnsi="Arial" w:cs="Arial"/>
+          <w:color w:val="0070C0"/>
+          <w:sz w:val="22"/>
+          <w:szCs w:val="22"/>
+        </w:rPr>
+        <w:t>: O arquivo “arq1” não existe e o enunciado não específica o que deve ocorrer.</w:t>
+      </w:r>
+    </w:p>
+    <w:p>
+      <w:pPr>
+        <w:rPr>
+          <w:rFonts w:ascii="Arial" w:hAnsi="Arial" w:cs="Arial"/>
+          <w:color w:val="0070C0"/>
+          <w:sz w:val="22"/>
+          <w:szCs w:val="22"/>
+        </w:rPr>
+      </w:pPr>
+      <w:r>
+        <w:rPr>
+          <w:rFonts w:ascii="Arial" w:hAnsi="Arial" w:cs="Arial"/>
+          <w:color w:val="0070C0"/>
+          <w:sz w:val="22"/>
+          <w:szCs w:val="22"/>
+        </w:rPr>
+        <w:tab/>
+      </w:r>
+    </w:p>
+    <w:p>
+      <w:pPr>
+        <w:pStyle w:val="PargrafodaLista"/>
+        <w:rPr>
+          <w:rFonts w:ascii="Arial" w:hAnsi="Arial" w:cs="Arial"/>
+          <w:color w:val="0070C0"/>
+          <w:sz w:val="22"/>
+          <w:szCs w:val="22"/>
+        </w:rPr>
+      </w:pPr>
     </w:p>
     <w:p>
       <w:pPr>
@@ -9999,8 +10798,6 @@
           <w:u w:val="single"/>
         </w:rPr>
       </w:pPr>
-      <w:bookmarkStart w:id="0" w:name="_GoBack"/>
-      <w:bookmarkEnd w:id="0"/>
     </w:p>
     <w:p>
       <w:pPr>
@@ -10064,6 +10861,66 @@
     </w:p>
     <w:p>
       <w:pPr>
+        <w:pStyle w:val="PargrafodaLista"/>
+        <w:ind w:left="0"/>
+        <w:rPr>
+          <w:rFonts w:ascii="Arial" w:hAnsi="Arial" w:cs="Arial"/>
+          <w:color w:val="0070C0"/>
+          <w:sz w:val="22"/>
+          <w:szCs w:val="22"/>
+        </w:rPr>
+      </w:pPr>
+    </w:p>
+    <w:p>
+      <w:pPr>
+        <w:pStyle w:val="PargrafodaLista"/>
+        <w:ind w:left="0"/>
+        <w:rPr>
+          <w:rFonts w:ascii="Arial" w:hAnsi="Arial" w:cs="Arial"/>
+          <w:color w:val="0070C0"/>
+          <w:sz w:val="22"/>
+          <w:szCs w:val="22"/>
+        </w:rPr>
+      </w:pPr>
+    </w:p>
+    <w:p>
+      <w:pPr>
+        <w:pStyle w:val="PargrafodaLista"/>
+        <w:ind w:left="0"/>
+        <w:rPr>
+          <w:rFonts w:ascii="Arial" w:hAnsi="Arial" w:cs="Arial"/>
+          <w:color w:val="0070C0"/>
+          <w:sz w:val="22"/>
+          <w:szCs w:val="22"/>
+        </w:rPr>
+      </w:pPr>
+    </w:p>
+    <w:p>
+      <w:pPr>
+        <w:pStyle w:val="PargrafodaLista"/>
+        <w:ind w:left="0"/>
+        <w:rPr>
+          <w:rFonts w:ascii="Arial" w:hAnsi="Arial" w:cs="Arial"/>
+          <w:color w:val="0070C0"/>
+          <w:sz w:val="22"/>
+          <w:szCs w:val="22"/>
+        </w:rPr>
+      </w:pPr>
+    </w:p>
+    <w:p>
+      <w:pPr>
+        <w:pStyle w:val="PargrafodaLista"/>
+        <w:ind w:left="0"/>
+        <w:rPr>
+          <w:rFonts w:ascii="Arial" w:hAnsi="Arial" w:cs="Arial"/>
+          <w:color w:val="0070C0"/>
+          <w:sz w:val="22"/>
+          <w:szCs w:val="22"/>
+        </w:rPr>
+      </w:pPr>
+    </w:p>
+    <w:p>
+      <w:pPr>
         <w:jc w:val="both"/>
         <w:rPr>
           <w:rFonts w:ascii="Arial" w:hAnsi="Arial" w:cs="Arial"/>
@@ -10078,6 +10935,7 @@
           <w:sz w:val="22"/>
           <w:szCs w:val="22"/>
         </w:rPr>
+        <w:lastRenderedPageBreak/>
         <w:t>6</w:t>
       </w:r>
       <w:r>
@@ -11474,6 +12332,711 @@
         <w:t>}</w:t>
       </w:r>
     </w:p>
+    <w:tbl>
+      <w:tblPr>
+        <w:tblStyle w:val="Tabelacomgrade"/>
+        <w:tblW w:w="0" w:type="auto"/>
+        <w:tblLook w:val="04A0" w:firstRow="1" w:lastRow="0" w:firstColumn="1" w:lastColumn="0" w:noHBand="0" w:noVBand="1"/>
+      </w:tblPr>
+      <w:tblGrid>
+        <w:gridCol w:w="3635"/>
+        <w:gridCol w:w="3636"/>
+        <w:gridCol w:w="3636"/>
+      </w:tblGrid>
+      <w:tr>
+        <w:tc>
+          <w:tcPr>
+            <w:tcW w:w="3635" w:type="dxa"/>
+          </w:tcPr>
+          <w:p>
+            <w:pPr>
+              <w:jc w:val="both"/>
+              <w:rPr>
+                <w:rFonts w:ascii="Arial" w:hAnsi="Arial" w:cs="Arial"/>
+                <w:b/>
+                <w:sz w:val="22"/>
+                <w:szCs w:val="22"/>
+              </w:rPr>
+            </w:pPr>
+            <w:r>
+              <w:rPr>
+                <w:rFonts w:ascii="Arial" w:hAnsi="Arial" w:cs="Arial"/>
+                <w:b/>
+                <w:sz w:val="22"/>
+                <w:szCs w:val="22"/>
+              </w:rPr>
+              <w:t>Condições de Entrada</w:t>
+            </w:r>
+          </w:p>
+        </w:tc>
+        <w:tc>
+          <w:tcPr>
+            <w:tcW w:w="3636" w:type="dxa"/>
+          </w:tcPr>
+          <w:p>
+            <w:pPr>
+              <w:jc w:val="both"/>
+              <w:rPr>
+                <w:rFonts w:ascii="Arial" w:hAnsi="Arial" w:cs="Arial"/>
+                <w:b/>
+                <w:sz w:val="22"/>
+                <w:szCs w:val="22"/>
+              </w:rPr>
+            </w:pPr>
+            <w:r>
+              <w:rPr>
+                <w:rFonts w:ascii="Arial" w:hAnsi="Arial" w:cs="Arial"/>
+                <w:b/>
+                <w:sz w:val="22"/>
+                <w:szCs w:val="22"/>
+              </w:rPr>
+              <w:t>Classes Válidas</w:t>
+            </w:r>
+          </w:p>
+        </w:tc>
+        <w:tc>
+          <w:tcPr>
+            <w:tcW w:w="3636" w:type="dxa"/>
+          </w:tcPr>
+          <w:p>
+            <w:pPr>
+              <w:jc w:val="both"/>
+              <w:rPr>
+                <w:rFonts w:ascii="Arial" w:hAnsi="Arial" w:cs="Arial"/>
+                <w:b/>
+                <w:sz w:val="22"/>
+                <w:szCs w:val="22"/>
+              </w:rPr>
+            </w:pPr>
+            <w:r>
+              <w:rPr>
+                <w:rFonts w:ascii="Arial" w:hAnsi="Arial" w:cs="Arial"/>
+                <w:b/>
+                <w:sz w:val="22"/>
+                <w:szCs w:val="22"/>
+              </w:rPr>
+              <w:t>Classes Inválidas</w:t>
+            </w:r>
+          </w:p>
+        </w:tc>
+      </w:tr>
+      <w:tr>
+        <w:tc>
+          <w:tcPr>
+            <w:tcW w:w="3635" w:type="dxa"/>
+          </w:tcPr>
+          <w:p>
+            <w:pPr>
+              <w:rPr>
+                <w:rFonts w:ascii="Arial" w:hAnsi="Arial" w:cs="Arial"/>
+                <w:sz w:val="22"/>
+                <w:szCs w:val="22"/>
+              </w:rPr>
+            </w:pPr>
+            <w:proofErr w:type="spellStart"/>
+            <w:r>
+              <w:rPr>
+                <w:rFonts w:ascii="Arial" w:hAnsi="Arial" w:cs="Arial"/>
+                <w:sz w:val="22"/>
+                <w:szCs w:val="22"/>
+              </w:rPr>
+              <w:t>Vet</w:t>
+            </w:r>
+            <w:proofErr w:type="spellEnd"/>
+            <w:r>
+              <w:rPr>
+                <w:rFonts w:ascii="Arial" w:hAnsi="Arial" w:cs="Arial"/>
+                <w:sz w:val="22"/>
+                <w:szCs w:val="22"/>
+              </w:rPr>
+              <w:t xml:space="preserve"> é vazio (condição booleana)</w:t>
+            </w:r>
+          </w:p>
+        </w:tc>
+        <w:tc>
+          <w:tcPr>
+            <w:tcW w:w="3636" w:type="dxa"/>
+          </w:tcPr>
+          <w:p>
+            <w:pPr>
+              <w:jc w:val="both"/>
+              <w:rPr>
+                <w:rFonts w:ascii="Arial" w:hAnsi="Arial" w:cs="Arial"/>
+                <w:sz w:val="22"/>
+                <w:szCs w:val="22"/>
+              </w:rPr>
+            </w:pPr>
+            <w:r>
+              <w:rPr>
+                <w:rFonts w:ascii="Arial" w:hAnsi="Arial" w:cs="Arial"/>
+                <w:sz w:val="22"/>
+                <w:szCs w:val="22"/>
+              </w:rPr>
+              <w:t>Não (1)</w:t>
+            </w:r>
+          </w:p>
+        </w:tc>
+        <w:tc>
+          <w:tcPr>
+            <w:tcW w:w="3636" w:type="dxa"/>
+          </w:tcPr>
+          <w:p>
+            <w:pPr>
+              <w:jc w:val="both"/>
+              <w:rPr>
+                <w:rFonts w:ascii="Arial" w:hAnsi="Arial" w:cs="Arial"/>
+                <w:sz w:val="22"/>
+                <w:szCs w:val="22"/>
+              </w:rPr>
+            </w:pPr>
+            <w:r>
+              <w:rPr>
+                <w:rFonts w:ascii="Arial" w:hAnsi="Arial" w:cs="Arial"/>
+                <w:sz w:val="22"/>
+                <w:szCs w:val="22"/>
+              </w:rPr>
+              <w:t>Sim (2)</w:t>
+            </w:r>
+          </w:p>
+        </w:tc>
+      </w:tr>
+      <w:tr>
+        <w:tc>
+          <w:tcPr>
+            <w:tcW w:w="3635" w:type="dxa"/>
+          </w:tcPr>
+          <w:p>
+            <w:pPr>
+              <w:rPr>
+                <w:rFonts w:ascii="Arial" w:hAnsi="Arial" w:cs="Arial"/>
+                <w:sz w:val="22"/>
+                <w:szCs w:val="22"/>
+              </w:rPr>
+            </w:pPr>
+            <w:proofErr w:type="spellStart"/>
+            <w:r>
+              <w:rPr>
+                <w:rFonts w:ascii="Arial" w:hAnsi="Arial" w:cs="Arial"/>
+                <w:sz w:val="22"/>
+                <w:szCs w:val="22"/>
+              </w:rPr>
+              <w:t>Vet</w:t>
+            </w:r>
+            <w:proofErr w:type="spellEnd"/>
+            <w:r>
+              <w:rPr>
+                <w:rFonts w:ascii="Arial" w:hAnsi="Arial" w:cs="Arial"/>
+                <w:sz w:val="22"/>
+                <w:szCs w:val="22"/>
+              </w:rPr>
+              <w:t xml:space="preserve"> é nulo (condição booleana)</w:t>
+            </w:r>
+          </w:p>
+        </w:tc>
+        <w:tc>
+          <w:tcPr>
+            <w:tcW w:w="3636" w:type="dxa"/>
+          </w:tcPr>
+          <w:p>
+            <w:pPr>
+              <w:jc w:val="both"/>
+              <w:rPr>
+                <w:rFonts w:ascii="Arial" w:hAnsi="Arial" w:cs="Arial"/>
+                <w:sz w:val="22"/>
+                <w:szCs w:val="22"/>
+              </w:rPr>
+            </w:pPr>
+            <w:r>
+              <w:rPr>
+                <w:rFonts w:ascii="Arial" w:hAnsi="Arial" w:cs="Arial"/>
+                <w:sz w:val="22"/>
+                <w:szCs w:val="22"/>
+              </w:rPr>
+              <w:t>Não (3)</w:t>
+            </w:r>
+          </w:p>
+        </w:tc>
+        <w:tc>
+          <w:tcPr>
+            <w:tcW w:w="3636" w:type="dxa"/>
+          </w:tcPr>
+          <w:p>
+            <w:pPr>
+              <w:jc w:val="both"/>
+              <w:rPr>
+                <w:rFonts w:ascii="Arial" w:hAnsi="Arial" w:cs="Arial"/>
+                <w:sz w:val="22"/>
+                <w:szCs w:val="22"/>
+              </w:rPr>
+            </w:pPr>
+            <w:r>
+              <w:rPr>
+                <w:rFonts w:ascii="Arial" w:hAnsi="Arial" w:cs="Arial"/>
+                <w:sz w:val="22"/>
+                <w:szCs w:val="22"/>
+              </w:rPr>
+              <w:t>Sim (4)</w:t>
+            </w:r>
+          </w:p>
+        </w:tc>
+      </w:tr>
+      <w:tr>
+        <w:tc>
+          <w:tcPr>
+            <w:tcW w:w="3635" w:type="dxa"/>
+          </w:tcPr>
+          <w:p>
+            <w:pPr>
+              <w:rPr>
+                <w:rFonts w:ascii="Arial" w:hAnsi="Arial" w:cs="Arial"/>
+                <w:sz w:val="22"/>
+                <w:szCs w:val="22"/>
+              </w:rPr>
+            </w:pPr>
+            <w:proofErr w:type="spellStart"/>
+            <w:r>
+              <w:rPr>
+                <w:rFonts w:ascii="Arial" w:hAnsi="Arial" w:cs="Arial"/>
+                <w:sz w:val="22"/>
+                <w:szCs w:val="22"/>
+              </w:rPr>
+              <w:t>Vet</w:t>
+            </w:r>
+            <w:proofErr w:type="spellEnd"/>
+            <w:r>
+              <w:rPr>
+                <w:rFonts w:ascii="Arial" w:hAnsi="Arial" w:cs="Arial"/>
+                <w:sz w:val="22"/>
+                <w:szCs w:val="22"/>
+              </w:rPr>
+              <w:t xml:space="preserve"> está </w:t>
+            </w:r>
+            <w:proofErr w:type="gramStart"/>
+            <w:r>
+              <w:rPr>
+                <w:rFonts w:ascii="Arial" w:hAnsi="Arial" w:cs="Arial"/>
+                <w:sz w:val="22"/>
+                <w:szCs w:val="22"/>
+              </w:rPr>
+              <w:t>ordenado(</w:t>
+            </w:r>
+            <w:proofErr w:type="gramEnd"/>
+            <w:r>
+              <w:rPr>
+                <w:rFonts w:ascii="Arial" w:hAnsi="Arial" w:cs="Arial"/>
+                <w:sz w:val="22"/>
+                <w:szCs w:val="22"/>
+              </w:rPr>
+              <w:t>condição booleana)</w:t>
+            </w:r>
+          </w:p>
+        </w:tc>
+        <w:tc>
+          <w:tcPr>
+            <w:tcW w:w="3636" w:type="dxa"/>
+          </w:tcPr>
+          <w:p>
+            <w:pPr>
+              <w:jc w:val="both"/>
+              <w:rPr>
+                <w:rFonts w:ascii="Arial" w:hAnsi="Arial" w:cs="Arial"/>
+                <w:sz w:val="22"/>
+                <w:szCs w:val="22"/>
+              </w:rPr>
+            </w:pPr>
+            <w:r>
+              <w:rPr>
+                <w:rFonts w:ascii="Arial" w:hAnsi="Arial" w:cs="Arial"/>
+                <w:sz w:val="22"/>
+                <w:szCs w:val="22"/>
+              </w:rPr>
+              <w:t>Sim (5)</w:t>
+            </w:r>
+          </w:p>
+        </w:tc>
+        <w:tc>
+          <w:tcPr>
+            <w:tcW w:w="3636" w:type="dxa"/>
+          </w:tcPr>
+          <w:p>
+            <w:pPr>
+              <w:jc w:val="both"/>
+              <w:rPr>
+                <w:rFonts w:ascii="Arial" w:hAnsi="Arial" w:cs="Arial"/>
+                <w:sz w:val="22"/>
+                <w:szCs w:val="22"/>
+              </w:rPr>
+            </w:pPr>
+            <w:r>
+              <w:rPr>
+                <w:rFonts w:ascii="Arial" w:hAnsi="Arial" w:cs="Arial"/>
+                <w:sz w:val="22"/>
+                <w:szCs w:val="22"/>
+              </w:rPr>
+              <w:t>Não (6)</w:t>
+            </w:r>
+          </w:p>
+        </w:tc>
+      </w:tr>
+      <w:tr>
+        <w:tc>
+          <w:tcPr>
+            <w:tcW w:w="3635" w:type="dxa"/>
+          </w:tcPr>
+          <w:p>
+            <w:pPr>
+              <w:rPr>
+                <w:rFonts w:ascii="Arial" w:hAnsi="Arial" w:cs="Arial"/>
+                <w:sz w:val="22"/>
+                <w:szCs w:val="22"/>
+              </w:rPr>
+            </w:pPr>
+            <w:r>
+              <w:rPr>
+                <w:rFonts w:ascii="Arial" w:hAnsi="Arial" w:cs="Arial"/>
+                <w:sz w:val="22"/>
+                <w:szCs w:val="22"/>
+              </w:rPr>
+              <w:t xml:space="preserve">Valor de </w:t>
+            </w:r>
+            <w:proofErr w:type="gramStart"/>
+            <w:r>
+              <w:rPr>
+                <w:rFonts w:ascii="Arial" w:hAnsi="Arial" w:cs="Arial"/>
+                <w:sz w:val="22"/>
+                <w:szCs w:val="22"/>
+              </w:rPr>
+              <w:t>esquerdo(</w:t>
+            </w:r>
+            <w:proofErr w:type="gramEnd"/>
+            <w:r>
+              <w:rPr>
+                <w:rFonts w:ascii="Arial" w:hAnsi="Arial" w:cs="Arial"/>
+                <w:sz w:val="22"/>
+                <w:szCs w:val="22"/>
+              </w:rPr>
+              <w:t>condição valor)</w:t>
+            </w:r>
+          </w:p>
+        </w:tc>
+        <w:tc>
+          <w:tcPr>
+            <w:tcW w:w="3636" w:type="dxa"/>
+          </w:tcPr>
+          <w:p>
+            <w:pPr>
+              <w:jc w:val="both"/>
+              <w:rPr>
+                <w:rFonts w:ascii="Arial" w:hAnsi="Arial" w:cs="Arial"/>
+                <w:sz w:val="22"/>
+                <w:szCs w:val="22"/>
+              </w:rPr>
+            </w:pPr>
+            <w:proofErr w:type="spellStart"/>
+            <w:r>
+              <w:rPr>
+                <w:rFonts w:ascii="Arial" w:hAnsi="Arial" w:cs="Arial"/>
+                <w:sz w:val="22"/>
+                <w:szCs w:val="22"/>
+              </w:rPr>
+              <w:t>Esq</w:t>
+            </w:r>
+            <w:proofErr w:type="spellEnd"/>
+            <w:r>
+              <w:rPr>
+                <w:rFonts w:ascii="Arial" w:hAnsi="Arial" w:cs="Arial"/>
+                <w:sz w:val="22"/>
+                <w:szCs w:val="22"/>
+              </w:rPr>
+              <w:t xml:space="preserve"> = 0 (7)</w:t>
+            </w:r>
+          </w:p>
+        </w:tc>
+        <w:tc>
+          <w:tcPr>
+            <w:tcW w:w="3636" w:type="dxa"/>
+          </w:tcPr>
+          <w:p>
+            <w:pPr>
+              <w:jc w:val="both"/>
+              <w:rPr>
+                <w:rFonts w:ascii="Arial" w:hAnsi="Arial" w:cs="Arial"/>
+                <w:sz w:val="22"/>
+                <w:szCs w:val="22"/>
+              </w:rPr>
+            </w:pPr>
+            <w:proofErr w:type="spellStart"/>
+            <w:r>
+              <w:rPr>
+                <w:rFonts w:ascii="Arial" w:hAnsi="Arial" w:cs="Arial"/>
+                <w:sz w:val="22"/>
+                <w:szCs w:val="22"/>
+              </w:rPr>
+              <w:t>Esq</w:t>
+            </w:r>
+            <w:proofErr w:type="spellEnd"/>
+            <w:r>
+              <w:rPr>
+                <w:rFonts w:ascii="Arial" w:hAnsi="Arial" w:cs="Arial"/>
+                <w:sz w:val="22"/>
+                <w:szCs w:val="22"/>
+              </w:rPr>
+              <w:t xml:space="preserve"> &lt; 0 (8)</w:t>
+            </w:r>
+          </w:p>
+          <w:p>
+            <w:pPr>
+              <w:jc w:val="both"/>
+              <w:rPr>
+                <w:rFonts w:ascii="Arial" w:hAnsi="Arial" w:cs="Arial"/>
+                <w:sz w:val="22"/>
+                <w:szCs w:val="22"/>
+              </w:rPr>
+            </w:pPr>
+            <w:proofErr w:type="spellStart"/>
+            <w:r>
+              <w:rPr>
+                <w:rFonts w:ascii="Arial" w:hAnsi="Arial" w:cs="Arial"/>
+                <w:sz w:val="22"/>
+                <w:szCs w:val="22"/>
+              </w:rPr>
+              <w:t>Esq</w:t>
+            </w:r>
+            <w:proofErr w:type="spellEnd"/>
+            <w:r>
+              <w:rPr>
+                <w:rFonts w:ascii="Arial" w:hAnsi="Arial" w:cs="Arial"/>
+                <w:sz w:val="22"/>
+                <w:szCs w:val="22"/>
+              </w:rPr>
+              <w:t xml:space="preserve"> &gt; 0 (9)</w:t>
+            </w:r>
+          </w:p>
+        </w:tc>
+      </w:tr>
+      <w:tr>
+        <w:tc>
+          <w:tcPr>
+            <w:tcW w:w="3635" w:type="dxa"/>
+          </w:tcPr>
+          <w:p>
+            <w:pPr>
+              <w:rPr>
+                <w:rFonts w:ascii="Arial" w:hAnsi="Arial" w:cs="Arial"/>
+                <w:sz w:val="22"/>
+                <w:szCs w:val="22"/>
+              </w:rPr>
+            </w:pPr>
+            <w:r>
+              <w:rPr>
+                <w:rFonts w:ascii="Arial" w:hAnsi="Arial" w:cs="Arial"/>
+                <w:sz w:val="22"/>
+                <w:szCs w:val="22"/>
+              </w:rPr>
+              <w:t xml:space="preserve">Valor de </w:t>
+            </w:r>
+            <w:proofErr w:type="gramStart"/>
+            <w:r>
+              <w:rPr>
+                <w:rFonts w:ascii="Arial" w:hAnsi="Arial" w:cs="Arial"/>
+                <w:sz w:val="22"/>
+                <w:szCs w:val="22"/>
+              </w:rPr>
+              <w:t>direita(</w:t>
+            </w:r>
+            <w:proofErr w:type="gramEnd"/>
+            <w:r>
+              <w:rPr>
+                <w:rFonts w:ascii="Arial" w:hAnsi="Arial" w:cs="Arial"/>
+                <w:sz w:val="22"/>
+                <w:szCs w:val="22"/>
+              </w:rPr>
+              <w:t>condição valor)</w:t>
+            </w:r>
+          </w:p>
+        </w:tc>
+        <w:tc>
+          <w:tcPr>
+            <w:tcW w:w="3636" w:type="dxa"/>
+          </w:tcPr>
+          <w:p>
+            <w:pPr>
+              <w:jc w:val="both"/>
+              <w:rPr>
+                <w:rFonts w:ascii="Arial" w:hAnsi="Arial" w:cs="Arial"/>
+                <w:sz w:val="22"/>
+                <w:szCs w:val="22"/>
+              </w:rPr>
+            </w:pPr>
+            <w:proofErr w:type="spellStart"/>
+            <w:r>
+              <w:rPr>
+                <w:rFonts w:ascii="Arial" w:hAnsi="Arial" w:cs="Arial"/>
+                <w:sz w:val="22"/>
+                <w:szCs w:val="22"/>
+              </w:rPr>
+              <w:t>Dir</w:t>
+            </w:r>
+            <w:proofErr w:type="spellEnd"/>
+            <w:r>
+              <w:rPr>
+                <w:rFonts w:ascii="Arial" w:hAnsi="Arial" w:cs="Arial"/>
+                <w:sz w:val="22"/>
+                <w:szCs w:val="22"/>
+              </w:rPr>
+              <w:t xml:space="preserve">= </w:t>
+            </w:r>
+            <w:proofErr w:type="spellStart"/>
+            <w:proofErr w:type="gramStart"/>
+            <w:r>
+              <w:rPr>
+                <w:rFonts w:ascii="Arial" w:hAnsi="Arial" w:cs="Arial"/>
+                <w:sz w:val="22"/>
+                <w:szCs w:val="22"/>
+              </w:rPr>
+              <w:t>pos.último</w:t>
+            </w:r>
+            <w:proofErr w:type="spellEnd"/>
+            <w:proofErr w:type="gramEnd"/>
+            <w:r>
+              <w:rPr>
+                <w:rFonts w:ascii="Arial" w:hAnsi="Arial" w:cs="Arial"/>
+                <w:sz w:val="22"/>
+                <w:szCs w:val="22"/>
+              </w:rPr>
+              <w:t xml:space="preserve"> elemento(10)</w:t>
+            </w:r>
+          </w:p>
+        </w:tc>
+        <w:tc>
+          <w:tcPr>
+            <w:tcW w:w="3636" w:type="dxa"/>
+          </w:tcPr>
+          <w:p>
+            <w:pPr>
+              <w:jc w:val="both"/>
+              <w:rPr>
+                <w:rFonts w:ascii="Arial" w:hAnsi="Arial" w:cs="Arial"/>
+                <w:sz w:val="22"/>
+                <w:szCs w:val="22"/>
+              </w:rPr>
+            </w:pPr>
+            <w:proofErr w:type="spellStart"/>
+            <w:r>
+              <w:rPr>
+                <w:rFonts w:ascii="Arial" w:hAnsi="Arial" w:cs="Arial"/>
+                <w:sz w:val="22"/>
+                <w:szCs w:val="22"/>
+              </w:rPr>
+              <w:t>Dir</w:t>
+            </w:r>
+            <w:proofErr w:type="spellEnd"/>
+            <w:r>
+              <w:rPr>
+                <w:rFonts w:ascii="Arial" w:hAnsi="Arial" w:cs="Arial"/>
+                <w:sz w:val="22"/>
+                <w:szCs w:val="22"/>
+              </w:rPr>
+              <w:t xml:space="preserve"> = &lt; </w:t>
+            </w:r>
+            <w:proofErr w:type="spellStart"/>
+            <w:proofErr w:type="gramStart"/>
+            <w:r>
+              <w:rPr>
+                <w:rFonts w:ascii="Arial" w:hAnsi="Arial" w:cs="Arial"/>
+                <w:sz w:val="22"/>
+                <w:szCs w:val="22"/>
+              </w:rPr>
+              <w:t>pos.últ</w:t>
+            </w:r>
+            <w:proofErr w:type="gramEnd"/>
+            <w:r>
+              <w:rPr>
+                <w:rFonts w:ascii="Arial" w:hAnsi="Arial" w:cs="Arial"/>
+                <w:sz w:val="22"/>
+                <w:szCs w:val="22"/>
+              </w:rPr>
+              <w:t>.el</w:t>
+            </w:r>
+            <w:proofErr w:type="spellEnd"/>
+            <w:r>
+              <w:rPr>
+                <w:rFonts w:ascii="Arial" w:hAnsi="Arial" w:cs="Arial"/>
+                <w:sz w:val="22"/>
+                <w:szCs w:val="22"/>
+              </w:rPr>
+              <w:t>(11)</w:t>
+            </w:r>
+          </w:p>
+          <w:p>
+            <w:pPr>
+              <w:jc w:val="both"/>
+              <w:rPr>
+                <w:rFonts w:ascii="Arial" w:hAnsi="Arial" w:cs="Arial"/>
+                <w:sz w:val="22"/>
+                <w:szCs w:val="22"/>
+              </w:rPr>
+            </w:pPr>
+            <w:proofErr w:type="spellStart"/>
+            <w:r>
+              <w:rPr>
+                <w:rFonts w:ascii="Arial" w:hAnsi="Arial" w:cs="Arial"/>
+                <w:sz w:val="22"/>
+                <w:szCs w:val="22"/>
+              </w:rPr>
+              <w:t>Dir</w:t>
+            </w:r>
+            <w:proofErr w:type="spellEnd"/>
+            <w:r>
+              <w:rPr>
+                <w:rFonts w:ascii="Arial" w:hAnsi="Arial" w:cs="Arial"/>
+                <w:sz w:val="22"/>
+                <w:szCs w:val="22"/>
+              </w:rPr>
+              <w:t xml:space="preserve"> = &gt; </w:t>
+            </w:r>
+            <w:proofErr w:type="spellStart"/>
+            <w:proofErr w:type="gramStart"/>
+            <w:r>
+              <w:rPr>
+                <w:rFonts w:ascii="Arial" w:hAnsi="Arial" w:cs="Arial"/>
+                <w:sz w:val="22"/>
+                <w:szCs w:val="22"/>
+              </w:rPr>
+              <w:t>pos.últ</w:t>
+            </w:r>
+            <w:proofErr w:type="gramEnd"/>
+            <w:r>
+              <w:rPr>
+                <w:rFonts w:ascii="Arial" w:hAnsi="Arial" w:cs="Arial"/>
+                <w:sz w:val="22"/>
+                <w:szCs w:val="22"/>
+              </w:rPr>
+              <w:t>.el</w:t>
+            </w:r>
+            <w:proofErr w:type="spellEnd"/>
+            <w:r>
+              <w:rPr>
+                <w:rFonts w:ascii="Arial" w:hAnsi="Arial" w:cs="Arial"/>
+                <w:sz w:val="22"/>
+                <w:szCs w:val="22"/>
+              </w:rPr>
+              <w:t>(12)</w:t>
+            </w:r>
+          </w:p>
+          <w:p>
+            <w:pPr>
+              <w:jc w:val="both"/>
+              <w:rPr>
+                <w:rFonts w:ascii="Arial" w:hAnsi="Arial" w:cs="Arial"/>
+                <w:sz w:val="22"/>
+                <w:szCs w:val="22"/>
+              </w:rPr>
+            </w:pPr>
+          </w:p>
+        </w:tc>
+      </w:tr>
+    </w:tbl>
     <w:p>
       <w:pPr>
         <w:pStyle w:val="PargrafodaLista"/>
@@ -11490,6 +13053,1851 @@
       <w:pPr>
         <w:pStyle w:val="PargrafodaLista"/>
         <w:ind w:left="0"/>
+        <w:jc w:val="both"/>
+        <w:rPr>
+          <w:rFonts w:ascii="Arial" w:hAnsi="Arial" w:cs="Arial"/>
+          <w:color w:val="0070C0"/>
+          <w:sz w:val="22"/>
+          <w:szCs w:val="22"/>
+        </w:rPr>
+      </w:pPr>
+      <w:r>
+        <w:rPr>
+          <w:rFonts w:ascii="Arial" w:hAnsi="Arial" w:cs="Arial"/>
+          <w:color w:val="0070C0"/>
+          <w:sz w:val="22"/>
+          <w:szCs w:val="22"/>
+        </w:rPr>
+        <w:t xml:space="preserve">Casos de teste das classes válidas: </w:t>
+      </w:r>
+    </w:p>
+    <w:p>
+      <w:pPr>
+        <w:pStyle w:val="PargrafodaLista"/>
+        <w:numPr>
+          <w:ilvl w:val="0"/>
+          <w:numId w:val="6"/>
+        </w:numPr>
+        <w:jc w:val="both"/>
+        <w:rPr>
+          <w:rFonts w:ascii="Arial" w:hAnsi="Arial" w:cs="Arial"/>
+          <w:color w:val="0070C0"/>
+          <w:sz w:val="22"/>
+          <w:szCs w:val="22"/>
+        </w:rPr>
+      </w:pPr>
+      <w:r>
+        <w:rPr>
+          <w:rFonts w:ascii="Arial" w:hAnsi="Arial" w:cs="Arial"/>
+          <w:color w:val="0070C0"/>
+          <w:sz w:val="22"/>
+          <w:szCs w:val="22"/>
+        </w:rPr>
+        <w:t>CT1 (atinge classes 1, 3, 5, 7, 10)</w:t>
+      </w:r>
+    </w:p>
+    <w:p>
+      <w:pPr>
+        <w:pStyle w:val="PargrafodaLista"/>
+        <w:jc w:val="both"/>
+        <w:rPr>
+          <w:rFonts w:ascii="Arial" w:hAnsi="Arial" w:cs="Arial"/>
+          <w:color w:val="0070C0"/>
+          <w:sz w:val="22"/>
+          <w:szCs w:val="22"/>
+        </w:rPr>
+      </w:pPr>
+      <w:proofErr w:type="spellStart"/>
+      <w:proofErr w:type="gramStart"/>
+      <w:r>
+        <w:rPr>
+          <w:rFonts w:ascii="Arial" w:hAnsi="Arial" w:cs="Arial"/>
+          <w:color w:val="0070C0"/>
+          <w:sz w:val="22"/>
+          <w:szCs w:val="22"/>
+        </w:rPr>
+        <w:t>Int</w:t>
+      </w:r>
+      <w:proofErr w:type="spellEnd"/>
+      <w:r>
+        <w:rPr>
+          <w:rFonts w:ascii="Arial" w:hAnsi="Arial" w:cs="Arial"/>
+          <w:color w:val="0070C0"/>
+          <w:sz w:val="22"/>
+          <w:szCs w:val="22"/>
+        </w:rPr>
+        <w:t>[</w:t>
+      </w:r>
+      <w:proofErr w:type="gramEnd"/>
+      <w:r>
+        <w:rPr>
+          <w:rFonts w:ascii="Arial" w:hAnsi="Arial" w:cs="Arial"/>
+          <w:color w:val="0070C0"/>
+          <w:sz w:val="22"/>
+          <w:szCs w:val="22"/>
+        </w:rPr>
+        <w:t xml:space="preserve">] v1 = new </w:t>
+      </w:r>
+      <w:proofErr w:type="spellStart"/>
+      <w:r>
+        <w:rPr>
+          <w:rFonts w:ascii="Arial" w:hAnsi="Arial" w:cs="Arial"/>
+          <w:color w:val="0070C0"/>
+          <w:sz w:val="22"/>
+          <w:szCs w:val="22"/>
+        </w:rPr>
+        <w:t>int</w:t>
+      </w:r>
+      <w:proofErr w:type="spellEnd"/>
+      <w:r>
+        <w:rPr>
+          <w:rFonts w:ascii="Arial" w:hAnsi="Arial" w:cs="Arial"/>
+          <w:color w:val="0070C0"/>
+          <w:sz w:val="22"/>
+          <w:szCs w:val="22"/>
+        </w:rPr>
+        <w:t>[50];</w:t>
+      </w:r>
+    </w:p>
+    <w:p>
+      <w:pPr>
+        <w:pStyle w:val="PargrafodaLista"/>
+        <w:jc w:val="both"/>
+        <w:rPr>
+          <w:rFonts w:ascii="Arial" w:hAnsi="Arial" w:cs="Arial"/>
+          <w:color w:val="0070C0"/>
+          <w:sz w:val="22"/>
+          <w:szCs w:val="22"/>
+        </w:rPr>
+      </w:pPr>
+      <w:r>
+        <w:rPr>
+          <w:rFonts w:ascii="Arial" w:hAnsi="Arial" w:cs="Arial"/>
+          <w:color w:val="0070C0"/>
+          <w:sz w:val="22"/>
+          <w:szCs w:val="22"/>
+        </w:rPr>
+        <w:t>V1[</w:t>
+      </w:r>
+      <w:proofErr w:type="gramStart"/>
+      <w:r>
+        <w:rPr>
+          <w:rFonts w:ascii="Arial" w:hAnsi="Arial" w:cs="Arial"/>
+          <w:color w:val="0070C0"/>
+          <w:sz w:val="22"/>
+          <w:szCs w:val="22"/>
+        </w:rPr>
+        <w:t>0]=</w:t>
+      </w:r>
+      <w:proofErr w:type="gramEnd"/>
+      <w:r>
+        <w:rPr>
+          <w:rFonts w:ascii="Arial" w:hAnsi="Arial" w:cs="Arial"/>
+          <w:color w:val="0070C0"/>
+          <w:sz w:val="22"/>
+          <w:szCs w:val="22"/>
+        </w:rPr>
+        <w:t xml:space="preserve"> -4;</w:t>
+      </w:r>
+    </w:p>
+    <w:p>
+      <w:pPr>
+        <w:pStyle w:val="PargrafodaLista"/>
+        <w:jc w:val="both"/>
+        <w:rPr>
+          <w:rFonts w:ascii="Arial" w:hAnsi="Arial" w:cs="Arial"/>
+          <w:color w:val="0070C0"/>
+          <w:sz w:val="22"/>
+          <w:szCs w:val="22"/>
+        </w:rPr>
+      </w:pPr>
+      <w:r>
+        <w:rPr>
+          <w:rFonts w:ascii="Arial" w:hAnsi="Arial" w:cs="Arial"/>
+          <w:color w:val="0070C0"/>
+          <w:sz w:val="22"/>
+          <w:szCs w:val="22"/>
+        </w:rPr>
+        <w:t>V1[</w:t>
+      </w:r>
+      <w:proofErr w:type="gramStart"/>
+      <w:r>
+        <w:rPr>
+          <w:rFonts w:ascii="Arial" w:hAnsi="Arial" w:cs="Arial"/>
+          <w:color w:val="0070C0"/>
+          <w:sz w:val="22"/>
+          <w:szCs w:val="22"/>
+        </w:rPr>
+        <w:t>1]=</w:t>
+      </w:r>
+      <w:proofErr w:type="gramEnd"/>
+      <w:r>
+        <w:rPr>
+          <w:rFonts w:ascii="Arial" w:hAnsi="Arial" w:cs="Arial"/>
+          <w:color w:val="0070C0"/>
+          <w:sz w:val="22"/>
+          <w:szCs w:val="22"/>
+        </w:rPr>
+        <w:t xml:space="preserve"> 3;</w:t>
+      </w:r>
+    </w:p>
+    <w:p>
+      <w:pPr>
+        <w:pStyle w:val="PargrafodaLista"/>
+        <w:jc w:val="both"/>
+        <w:rPr>
+          <w:rFonts w:ascii="Arial" w:hAnsi="Arial" w:cs="Arial"/>
+          <w:color w:val="0070C0"/>
+          <w:sz w:val="22"/>
+          <w:szCs w:val="22"/>
+        </w:rPr>
+      </w:pPr>
+      <w:r>
+        <w:rPr>
+          <w:rFonts w:ascii="Arial" w:hAnsi="Arial" w:cs="Arial"/>
+          <w:color w:val="0070C0"/>
+          <w:sz w:val="22"/>
+          <w:szCs w:val="22"/>
+        </w:rPr>
+        <w:t>V1[</w:t>
+      </w:r>
+      <w:proofErr w:type="gramStart"/>
+      <w:r>
+        <w:rPr>
+          <w:rFonts w:ascii="Arial" w:hAnsi="Arial" w:cs="Arial"/>
+          <w:color w:val="0070C0"/>
+          <w:sz w:val="22"/>
+          <w:szCs w:val="22"/>
+        </w:rPr>
+        <w:t>2]=</w:t>
+      </w:r>
+      <w:proofErr w:type="gramEnd"/>
+      <w:r>
+        <w:rPr>
+          <w:rFonts w:ascii="Arial" w:hAnsi="Arial" w:cs="Arial"/>
+          <w:color w:val="0070C0"/>
+          <w:sz w:val="22"/>
+          <w:szCs w:val="22"/>
+        </w:rPr>
+        <w:t xml:space="preserve"> 14;</w:t>
+      </w:r>
+    </w:p>
+    <w:p>
+      <w:pPr>
+        <w:pStyle w:val="PargrafodaLista"/>
+        <w:jc w:val="both"/>
+        <w:rPr>
+          <w:rFonts w:ascii="Arial" w:hAnsi="Arial" w:cs="Arial"/>
+          <w:color w:val="0070C0"/>
+          <w:sz w:val="22"/>
+          <w:szCs w:val="22"/>
+        </w:rPr>
+      </w:pPr>
+      <w:r>
+        <w:rPr>
+          <w:rFonts w:ascii="Arial" w:hAnsi="Arial" w:cs="Arial"/>
+          <w:color w:val="0070C0"/>
+          <w:sz w:val="22"/>
+          <w:szCs w:val="22"/>
+        </w:rPr>
+        <w:t>V1[</w:t>
+      </w:r>
+      <w:proofErr w:type="gramStart"/>
+      <w:r>
+        <w:rPr>
+          <w:rFonts w:ascii="Arial" w:hAnsi="Arial" w:cs="Arial"/>
+          <w:color w:val="0070C0"/>
+          <w:sz w:val="22"/>
+          <w:szCs w:val="22"/>
+        </w:rPr>
+        <w:t>3]=</w:t>
+      </w:r>
+      <w:proofErr w:type="gramEnd"/>
+      <w:r>
+        <w:rPr>
+          <w:rFonts w:ascii="Arial" w:hAnsi="Arial" w:cs="Arial"/>
+          <w:color w:val="0070C0"/>
+          <w:sz w:val="22"/>
+          <w:szCs w:val="22"/>
+        </w:rPr>
+        <w:t xml:space="preserve"> 31;</w:t>
+      </w:r>
+    </w:p>
+    <w:p>
+      <w:pPr>
+        <w:pStyle w:val="PargrafodaLista"/>
+        <w:jc w:val="both"/>
+        <w:rPr>
+          <w:rFonts w:ascii="Arial" w:hAnsi="Arial" w:cs="Arial"/>
+          <w:color w:val="0070C0"/>
+          <w:sz w:val="22"/>
+          <w:szCs w:val="22"/>
+        </w:rPr>
+      </w:pPr>
+      <w:r>
+        <w:rPr>
+          <w:rFonts w:ascii="Arial" w:hAnsi="Arial" w:cs="Arial"/>
+          <w:color w:val="0070C0"/>
+          <w:sz w:val="22"/>
+          <w:szCs w:val="22"/>
+        </w:rPr>
+        <w:t>V1[</w:t>
+      </w:r>
+      <w:proofErr w:type="gramStart"/>
+      <w:r>
+        <w:rPr>
+          <w:rFonts w:ascii="Arial" w:hAnsi="Arial" w:cs="Arial"/>
+          <w:color w:val="0070C0"/>
+          <w:sz w:val="22"/>
+          <w:szCs w:val="22"/>
+        </w:rPr>
+        <w:t>4]=</w:t>
+      </w:r>
+      <w:proofErr w:type="gramEnd"/>
+      <w:r>
+        <w:rPr>
+          <w:rFonts w:ascii="Arial" w:hAnsi="Arial" w:cs="Arial"/>
+          <w:color w:val="0070C0"/>
+          <w:sz w:val="22"/>
+          <w:szCs w:val="22"/>
+        </w:rPr>
+        <w:t xml:space="preserve"> 56;</w:t>
+      </w:r>
+    </w:p>
+    <w:p>
+      <w:pPr>
+        <w:pStyle w:val="PargrafodaLista"/>
+        <w:jc w:val="both"/>
+        <w:rPr>
+          <w:rFonts w:ascii="Arial" w:hAnsi="Arial" w:cs="Arial"/>
+          <w:color w:val="0070C0"/>
+          <w:sz w:val="22"/>
+          <w:szCs w:val="22"/>
+        </w:rPr>
+      </w:pPr>
+      <w:proofErr w:type="spellStart"/>
+      <w:r>
+        <w:rPr>
+          <w:rFonts w:ascii="Arial" w:hAnsi="Arial" w:cs="Arial"/>
+          <w:color w:val="0070C0"/>
+          <w:sz w:val="22"/>
+          <w:szCs w:val="22"/>
+        </w:rPr>
+        <w:t>Int</w:t>
+      </w:r>
+      <w:proofErr w:type="spellEnd"/>
+      <w:r>
+        <w:rPr>
+          <w:rFonts w:ascii="Arial" w:hAnsi="Arial" w:cs="Arial"/>
+          <w:color w:val="0070C0"/>
+          <w:sz w:val="22"/>
+          <w:szCs w:val="22"/>
+        </w:rPr>
+        <w:t xml:space="preserve"> p</w:t>
+      </w:r>
+      <w:r>
+        <w:rPr>
+          <w:rFonts w:ascii="Arial" w:hAnsi="Arial" w:cs="Arial"/>
+          <w:color w:val="0070C0"/>
+          <w:sz w:val="22"/>
+          <w:szCs w:val="22"/>
+        </w:rPr>
+        <w:t>1</w:t>
+      </w:r>
+      <w:r>
+        <w:rPr>
+          <w:rFonts w:ascii="Arial" w:hAnsi="Arial" w:cs="Arial"/>
+          <w:color w:val="0070C0"/>
+          <w:sz w:val="22"/>
+          <w:szCs w:val="22"/>
+        </w:rPr>
+        <w:t xml:space="preserve"> = </w:t>
+      </w:r>
+      <w:proofErr w:type="spellStart"/>
+      <w:proofErr w:type="gramStart"/>
+      <w:r>
+        <w:rPr>
+          <w:rFonts w:ascii="Arial" w:hAnsi="Arial" w:cs="Arial"/>
+          <w:color w:val="0070C0"/>
+          <w:sz w:val="22"/>
+          <w:szCs w:val="22"/>
+        </w:rPr>
+        <w:t>BuscaBinaria</w:t>
+      </w:r>
+      <w:proofErr w:type="spellEnd"/>
+      <w:r>
+        <w:rPr>
+          <w:rFonts w:ascii="Arial" w:hAnsi="Arial" w:cs="Arial"/>
+          <w:color w:val="0070C0"/>
+          <w:sz w:val="22"/>
+          <w:szCs w:val="22"/>
+        </w:rPr>
+        <w:t>(</w:t>
+      </w:r>
+      <w:proofErr w:type="gramEnd"/>
+      <w:r>
+        <w:rPr>
+          <w:rFonts w:ascii="Arial" w:hAnsi="Arial" w:cs="Arial"/>
+          <w:color w:val="0070C0"/>
+          <w:sz w:val="22"/>
+          <w:szCs w:val="22"/>
+        </w:rPr>
+        <w:t>v</w:t>
+      </w:r>
+      <w:r>
+        <w:rPr>
+          <w:rFonts w:ascii="Arial" w:hAnsi="Arial" w:cs="Arial"/>
+          <w:color w:val="0070C0"/>
+          <w:sz w:val="22"/>
+          <w:szCs w:val="22"/>
+        </w:rPr>
+        <w:t>1</w:t>
+      </w:r>
+      <w:r>
+        <w:rPr>
+          <w:rFonts w:ascii="Arial" w:hAnsi="Arial" w:cs="Arial"/>
+          <w:color w:val="0070C0"/>
+          <w:sz w:val="22"/>
+          <w:szCs w:val="22"/>
+        </w:rPr>
+        <w:t>, 0, 4, 3); //1</w:t>
+      </w:r>
+    </w:p>
+    <w:p>
+      <w:pPr>
+        <w:pStyle w:val="PargrafodaLista"/>
+        <w:numPr>
+          <w:ilvl w:val="0"/>
+          <w:numId w:val="6"/>
+        </w:numPr>
+        <w:jc w:val="both"/>
+        <w:rPr>
+          <w:rFonts w:ascii="Arial" w:hAnsi="Arial" w:cs="Arial"/>
+          <w:color w:val="0070C0"/>
+          <w:sz w:val="22"/>
+          <w:szCs w:val="22"/>
+        </w:rPr>
+      </w:pPr>
+      <w:r>
+        <w:rPr>
+          <w:rFonts w:ascii="Arial" w:hAnsi="Arial" w:cs="Arial"/>
+          <w:color w:val="0070C0"/>
+          <w:sz w:val="22"/>
+          <w:szCs w:val="22"/>
+        </w:rPr>
+        <w:t>CT2(atinge classe 1, 3, 5, 7, 10)</w:t>
+      </w:r>
+    </w:p>
+    <w:p>
+      <w:pPr>
+        <w:pStyle w:val="PargrafodaLista"/>
+        <w:jc w:val="both"/>
+        <w:rPr>
+          <w:rFonts w:ascii="Arial" w:hAnsi="Arial" w:cs="Arial"/>
+          <w:color w:val="0070C0"/>
+          <w:sz w:val="22"/>
+          <w:szCs w:val="22"/>
+        </w:rPr>
+      </w:pPr>
+      <w:proofErr w:type="spellStart"/>
+      <w:proofErr w:type="gramStart"/>
+      <w:r>
+        <w:rPr>
+          <w:rFonts w:ascii="Arial" w:hAnsi="Arial" w:cs="Arial"/>
+          <w:color w:val="0070C0"/>
+          <w:sz w:val="22"/>
+          <w:szCs w:val="22"/>
+        </w:rPr>
+        <w:t>Int</w:t>
+      </w:r>
+      <w:proofErr w:type="spellEnd"/>
+      <w:r>
+        <w:rPr>
+          <w:rFonts w:ascii="Arial" w:hAnsi="Arial" w:cs="Arial"/>
+          <w:color w:val="0070C0"/>
+          <w:sz w:val="22"/>
+          <w:szCs w:val="22"/>
+        </w:rPr>
+        <w:t>[</w:t>
+      </w:r>
+      <w:proofErr w:type="gramEnd"/>
+      <w:r>
+        <w:rPr>
+          <w:rFonts w:ascii="Arial" w:hAnsi="Arial" w:cs="Arial"/>
+          <w:color w:val="0070C0"/>
+          <w:sz w:val="22"/>
+          <w:szCs w:val="22"/>
+        </w:rPr>
+        <w:t xml:space="preserve">] v2 = new </w:t>
+      </w:r>
+      <w:proofErr w:type="spellStart"/>
+      <w:r>
+        <w:rPr>
+          <w:rFonts w:ascii="Arial" w:hAnsi="Arial" w:cs="Arial"/>
+          <w:color w:val="0070C0"/>
+          <w:sz w:val="22"/>
+          <w:szCs w:val="22"/>
+        </w:rPr>
+        <w:t>int</w:t>
+      </w:r>
+      <w:proofErr w:type="spellEnd"/>
+      <w:r>
+        <w:rPr>
+          <w:rFonts w:ascii="Arial" w:hAnsi="Arial" w:cs="Arial"/>
+          <w:color w:val="0070C0"/>
+          <w:sz w:val="22"/>
+          <w:szCs w:val="22"/>
+        </w:rPr>
+        <w:t>[50];</w:t>
+      </w:r>
+    </w:p>
+    <w:p>
+      <w:pPr>
+        <w:pStyle w:val="PargrafodaLista"/>
+        <w:jc w:val="both"/>
+        <w:rPr>
+          <w:rFonts w:ascii="Arial" w:hAnsi="Arial" w:cs="Arial"/>
+          <w:color w:val="0070C0"/>
+          <w:sz w:val="22"/>
+          <w:szCs w:val="22"/>
+        </w:rPr>
+      </w:pPr>
+      <w:r>
+        <w:rPr>
+          <w:rFonts w:ascii="Arial" w:hAnsi="Arial" w:cs="Arial"/>
+          <w:color w:val="0070C0"/>
+          <w:sz w:val="22"/>
+          <w:szCs w:val="22"/>
+        </w:rPr>
+        <w:t>V</w:t>
+      </w:r>
+      <w:r>
+        <w:rPr>
+          <w:rFonts w:ascii="Arial" w:hAnsi="Arial" w:cs="Arial"/>
+          <w:color w:val="0070C0"/>
+          <w:sz w:val="22"/>
+          <w:szCs w:val="22"/>
+        </w:rPr>
+        <w:t>2</w:t>
+      </w:r>
+      <w:r>
+        <w:rPr>
+          <w:rFonts w:ascii="Arial" w:hAnsi="Arial" w:cs="Arial"/>
+          <w:color w:val="0070C0"/>
+          <w:sz w:val="22"/>
+          <w:szCs w:val="22"/>
+        </w:rPr>
+        <w:t>[</w:t>
+      </w:r>
+      <w:proofErr w:type="gramStart"/>
+      <w:r>
+        <w:rPr>
+          <w:rFonts w:ascii="Arial" w:hAnsi="Arial" w:cs="Arial"/>
+          <w:color w:val="0070C0"/>
+          <w:sz w:val="22"/>
+          <w:szCs w:val="22"/>
+        </w:rPr>
+        <w:t>0]=</w:t>
+      </w:r>
+      <w:proofErr w:type="gramEnd"/>
+      <w:r>
+        <w:rPr>
+          <w:rFonts w:ascii="Arial" w:hAnsi="Arial" w:cs="Arial"/>
+          <w:color w:val="0070C0"/>
+          <w:sz w:val="22"/>
+          <w:szCs w:val="22"/>
+        </w:rPr>
+        <w:t xml:space="preserve"> -4;</w:t>
+      </w:r>
+    </w:p>
+    <w:p>
+      <w:pPr>
+        <w:pStyle w:val="PargrafodaLista"/>
+        <w:jc w:val="both"/>
+        <w:rPr>
+          <w:rFonts w:ascii="Arial" w:hAnsi="Arial" w:cs="Arial"/>
+          <w:color w:val="0070C0"/>
+          <w:sz w:val="22"/>
+          <w:szCs w:val="22"/>
+        </w:rPr>
+      </w:pPr>
+      <w:r>
+        <w:rPr>
+          <w:rFonts w:ascii="Arial" w:hAnsi="Arial" w:cs="Arial"/>
+          <w:color w:val="0070C0"/>
+          <w:sz w:val="22"/>
+          <w:szCs w:val="22"/>
+        </w:rPr>
+        <w:t>V</w:t>
+      </w:r>
+      <w:r>
+        <w:rPr>
+          <w:rFonts w:ascii="Arial" w:hAnsi="Arial" w:cs="Arial"/>
+          <w:color w:val="0070C0"/>
+          <w:sz w:val="22"/>
+          <w:szCs w:val="22"/>
+        </w:rPr>
+        <w:t>2</w:t>
+      </w:r>
+      <w:r>
+        <w:rPr>
+          <w:rFonts w:ascii="Arial" w:hAnsi="Arial" w:cs="Arial"/>
+          <w:color w:val="0070C0"/>
+          <w:sz w:val="22"/>
+          <w:szCs w:val="22"/>
+        </w:rPr>
+        <w:t>[</w:t>
+      </w:r>
+      <w:proofErr w:type="gramStart"/>
+      <w:r>
+        <w:rPr>
+          <w:rFonts w:ascii="Arial" w:hAnsi="Arial" w:cs="Arial"/>
+          <w:color w:val="0070C0"/>
+          <w:sz w:val="22"/>
+          <w:szCs w:val="22"/>
+        </w:rPr>
+        <w:t>1]=</w:t>
+      </w:r>
+      <w:proofErr w:type="gramEnd"/>
+      <w:r>
+        <w:rPr>
+          <w:rFonts w:ascii="Arial" w:hAnsi="Arial" w:cs="Arial"/>
+          <w:color w:val="0070C0"/>
+          <w:sz w:val="22"/>
+          <w:szCs w:val="22"/>
+        </w:rPr>
+        <w:t xml:space="preserve"> 3;</w:t>
+      </w:r>
+    </w:p>
+    <w:p>
+      <w:pPr>
+        <w:pStyle w:val="PargrafodaLista"/>
+        <w:jc w:val="both"/>
+        <w:rPr>
+          <w:rFonts w:ascii="Arial" w:hAnsi="Arial" w:cs="Arial"/>
+          <w:color w:val="0070C0"/>
+          <w:sz w:val="22"/>
+          <w:szCs w:val="22"/>
+        </w:rPr>
+      </w:pPr>
+      <w:r>
+        <w:rPr>
+          <w:rFonts w:ascii="Arial" w:hAnsi="Arial" w:cs="Arial"/>
+          <w:color w:val="0070C0"/>
+          <w:sz w:val="22"/>
+          <w:szCs w:val="22"/>
+        </w:rPr>
+        <w:t>V</w:t>
+      </w:r>
+      <w:r>
+        <w:rPr>
+          <w:rFonts w:ascii="Arial" w:hAnsi="Arial" w:cs="Arial"/>
+          <w:color w:val="0070C0"/>
+          <w:sz w:val="22"/>
+          <w:szCs w:val="22"/>
+        </w:rPr>
+        <w:t>2</w:t>
+      </w:r>
+      <w:r>
+        <w:rPr>
+          <w:rFonts w:ascii="Arial" w:hAnsi="Arial" w:cs="Arial"/>
+          <w:color w:val="0070C0"/>
+          <w:sz w:val="22"/>
+          <w:szCs w:val="22"/>
+        </w:rPr>
+        <w:t>[</w:t>
+      </w:r>
+      <w:proofErr w:type="gramStart"/>
+      <w:r>
+        <w:rPr>
+          <w:rFonts w:ascii="Arial" w:hAnsi="Arial" w:cs="Arial"/>
+          <w:color w:val="0070C0"/>
+          <w:sz w:val="22"/>
+          <w:szCs w:val="22"/>
+        </w:rPr>
+        <w:t>2]=</w:t>
+      </w:r>
+      <w:proofErr w:type="gramEnd"/>
+      <w:r>
+        <w:rPr>
+          <w:rFonts w:ascii="Arial" w:hAnsi="Arial" w:cs="Arial"/>
+          <w:color w:val="0070C0"/>
+          <w:sz w:val="22"/>
+          <w:szCs w:val="22"/>
+        </w:rPr>
+        <w:t xml:space="preserve"> 14;</w:t>
+      </w:r>
+    </w:p>
+    <w:p>
+      <w:pPr>
+        <w:pStyle w:val="PargrafodaLista"/>
+        <w:jc w:val="both"/>
+        <w:rPr>
+          <w:rFonts w:ascii="Arial" w:hAnsi="Arial" w:cs="Arial"/>
+          <w:color w:val="0070C0"/>
+          <w:sz w:val="22"/>
+          <w:szCs w:val="22"/>
+        </w:rPr>
+      </w:pPr>
+      <w:r>
+        <w:rPr>
+          <w:rFonts w:ascii="Arial" w:hAnsi="Arial" w:cs="Arial"/>
+          <w:color w:val="0070C0"/>
+          <w:sz w:val="22"/>
+          <w:szCs w:val="22"/>
+        </w:rPr>
+        <w:t>V</w:t>
+      </w:r>
+      <w:r>
+        <w:rPr>
+          <w:rFonts w:ascii="Arial" w:hAnsi="Arial" w:cs="Arial"/>
+          <w:color w:val="0070C0"/>
+          <w:sz w:val="22"/>
+          <w:szCs w:val="22"/>
+        </w:rPr>
+        <w:t>2</w:t>
+      </w:r>
+      <w:r>
+        <w:rPr>
+          <w:rFonts w:ascii="Arial" w:hAnsi="Arial" w:cs="Arial"/>
+          <w:color w:val="0070C0"/>
+          <w:sz w:val="22"/>
+          <w:szCs w:val="22"/>
+        </w:rPr>
+        <w:t>[</w:t>
+      </w:r>
+      <w:proofErr w:type="gramStart"/>
+      <w:r>
+        <w:rPr>
+          <w:rFonts w:ascii="Arial" w:hAnsi="Arial" w:cs="Arial"/>
+          <w:color w:val="0070C0"/>
+          <w:sz w:val="22"/>
+          <w:szCs w:val="22"/>
+        </w:rPr>
+        <w:t>3]=</w:t>
+      </w:r>
+      <w:proofErr w:type="gramEnd"/>
+      <w:r>
+        <w:rPr>
+          <w:rFonts w:ascii="Arial" w:hAnsi="Arial" w:cs="Arial"/>
+          <w:color w:val="0070C0"/>
+          <w:sz w:val="22"/>
+          <w:szCs w:val="22"/>
+        </w:rPr>
+        <w:t xml:space="preserve"> 31;</w:t>
+      </w:r>
+    </w:p>
+    <w:p>
+      <w:pPr>
+        <w:pStyle w:val="PargrafodaLista"/>
+        <w:jc w:val="both"/>
+        <w:rPr>
+          <w:rFonts w:ascii="Arial" w:hAnsi="Arial" w:cs="Arial"/>
+          <w:color w:val="0070C0"/>
+          <w:sz w:val="22"/>
+          <w:szCs w:val="22"/>
+        </w:rPr>
+      </w:pPr>
+      <w:r>
+        <w:rPr>
+          <w:rFonts w:ascii="Arial" w:hAnsi="Arial" w:cs="Arial"/>
+          <w:color w:val="0070C0"/>
+          <w:sz w:val="22"/>
+          <w:szCs w:val="22"/>
+        </w:rPr>
+        <w:t>V</w:t>
+      </w:r>
+      <w:r>
+        <w:rPr>
+          <w:rFonts w:ascii="Arial" w:hAnsi="Arial" w:cs="Arial"/>
+          <w:color w:val="0070C0"/>
+          <w:sz w:val="22"/>
+          <w:szCs w:val="22"/>
+        </w:rPr>
+        <w:t>2</w:t>
+      </w:r>
+      <w:r>
+        <w:rPr>
+          <w:rFonts w:ascii="Arial" w:hAnsi="Arial" w:cs="Arial"/>
+          <w:color w:val="0070C0"/>
+          <w:sz w:val="22"/>
+          <w:szCs w:val="22"/>
+        </w:rPr>
+        <w:t>[</w:t>
+      </w:r>
+      <w:proofErr w:type="gramStart"/>
+      <w:r>
+        <w:rPr>
+          <w:rFonts w:ascii="Arial" w:hAnsi="Arial" w:cs="Arial"/>
+          <w:color w:val="0070C0"/>
+          <w:sz w:val="22"/>
+          <w:szCs w:val="22"/>
+        </w:rPr>
+        <w:t>4]=</w:t>
+      </w:r>
+      <w:proofErr w:type="gramEnd"/>
+      <w:r>
+        <w:rPr>
+          <w:rFonts w:ascii="Arial" w:hAnsi="Arial" w:cs="Arial"/>
+          <w:color w:val="0070C0"/>
+          <w:sz w:val="22"/>
+          <w:szCs w:val="22"/>
+        </w:rPr>
+        <w:t xml:space="preserve"> 56;</w:t>
+      </w:r>
+    </w:p>
+    <w:p>
+      <w:pPr>
+        <w:pStyle w:val="PargrafodaLista"/>
+        <w:jc w:val="both"/>
+        <w:rPr>
+          <w:rFonts w:ascii="Arial" w:hAnsi="Arial" w:cs="Arial"/>
+          <w:color w:val="0070C0"/>
+          <w:sz w:val="22"/>
+          <w:szCs w:val="22"/>
+        </w:rPr>
+      </w:pPr>
+      <w:proofErr w:type="spellStart"/>
+      <w:r>
+        <w:rPr>
+          <w:rFonts w:ascii="Arial" w:hAnsi="Arial" w:cs="Arial"/>
+          <w:color w:val="0070C0"/>
+          <w:sz w:val="22"/>
+          <w:szCs w:val="22"/>
+        </w:rPr>
+        <w:t>Int</w:t>
+      </w:r>
+      <w:proofErr w:type="spellEnd"/>
+      <w:r>
+        <w:rPr>
+          <w:rFonts w:ascii="Arial" w:hAnsi="Arial" w:cs="Arial"/>
+          <w:color w:val="0070C0"/>
+          <w:sz w:val="22"/>
+          <w:szCs w:val="22"/>
+        </w:rPr>
+        <w:t xml:space="preserve"> p</w:t>
+      </w:r>
+      <w:r>
+        <w:rPr>
+          <w:rFonts w:ascii="Arial" w:hAnsi="Arial" w:cs="Arial"/>
+          <w:color w:val="0070C0"/>
+          <w:sz w:val="22"/>
+          <w:szCs w:val="22"/>
+        </w:rPr>
+        <w:t>2</w:t>
+      </w:r>
+      <w:r>
+        <w:rPr>
+          <w:rFonts w:ascii="Arial" w:hAnsi="Arial" w:cs="Arial"/>
+          <w:color w:val="0070C0"/>
+          <w:sz w:val="22"/>
+          <w:szCs w:val="22"/>
+        </w:rPr>
+        <w:t xml:space="preserve"> = </w:t>
+      </w:r>
+      <w:proofErr w:type="spellStart"/>
+      <w:proofErr w:type="gramStart"/>
+      <w:r>
+        <w:rPr>
+          <w:rFonts w:ascii="Arial" w:hAnsi="Arial" w:cs="Arial"/>
+          <w:color w:val="0070C0"/>
+          <w:sz w:val="22"/>
+          <w:szCs w:val="22"/>
+        </w:rPr>
+        <w:t>BuscaBinaria</w:t>
+      </w:r>
+      <w:proofErr w:type="spellEnd"/>
+      <w:r>
+        <w:rPr>
+          <w:rFonts w:ascii="Arial" w:hAnsi="Arial" w:cs="Arial"/>
+          <w:color w:val="0070C0"/>
+          <w:sz w:val="22"/>
+          <w:szCs w:val="22"/>
+        </w:rPr>
+        <w:t>(</w:t>
+      </w:r>
+      <w:proofErr w:type="gramEnd"/>
+      <w:r>
+        <w:rPr>
+          <w:rFonts w:ascii="Arial" w:hAnsi="Arial" w:cs="Arial"/>
+          <w:color w:val="0070C0"/>
+          <w:sz w:val="22"/>
+          <w:szCs w:val="22"/>
+        </w:rPr>
+        <w:t>v</w:t>
+      </w:r>
+      <w:r>
+        <w:rPr>
+          <w:rFonts w:ascii="Arial" w:hAnsi="Arial" w:cs="Arial"/>
+          <w:color w:val="0070C0"/>
+          <w:sz w:val="22"/>
+          <w:szCs w:val="22"/>
+        </w:rPr>
+        <w:t>2</w:t>
+      </w:r>
+      <w:r>
+        <w:rPr>
+          <w:rFonts w:ascii="Arial" w:hAnsi="Arial" w:cs="Arial"/>
+          <w:color w:val="0070C0"/>
+          <w:sz w:val="22"/>
+          <w:szCs w:val="22"/>
+        </w:rPr>
+        <w:t>, 0, 4, 3</w:t>
+      </w:r>
+      <w:r>
+        <w:rPr>
+          <w:rFonts w:ascii="Arial" w:hAnsi="Arial" w:cs="Arial"/>
+          <w:color w:val="0070C0"/>
+          <w:sz w:val="22"/>
+          <w:szCs w:val="22"/>
+        </w:rPr>
+        <w:t>7</w:t>
+      </w:r>
+      <w:r>
+        <w:rPr>
+          <w:rFonts w:ascii="Arial" w:hAnsi="Arial" w:cs="Arial"/>
+          <w:color w:val="0070C0"/>
+          <w:sz w:val="22"/>
+          <w:szCs w:val="22"/>
+        </w:rPr>
+        <w:t>); //</w:t>
+      </w:r>
+      <w:r>
+        <w:rPr>
+          <w:rFonts w:ascii="Arial" w:hAnsi="Arial" w:cs="Arial"/>
+          <w:color w:val="0070C0"/>
+          <w:sz w:val="22"/>
+          <w:szCs w:val="22"/>
+        </w:rPr>
+        <w:t>-</w:t>
+      </w:r>
+      <w:r>
+        <w:rPr>
+          <w:rFonts w:ascii="Arial" w:hAnsi="Arial" w:cs="Arial"/>
+          <w:color w:val="0070C0"/>
+          <w:sz w:val="22"/>
+          <w:szCs w:val="22"/>
+        </w:rPr>
+        <w:t>1</w:t>
+      </w:r>
+    </w:p>
+    <w:p>
+      <w:pPr>
+        <w:jc w:val="both"/>
+        <w:rPr>
+          <w:rFonts w:ascii="Arial" w:hAnsi="Arial" w:cs="Arial"/>
+          <w:color w:val="0070C0"/>
+          <w:sz w:val="22"/>
+          <w:szCs w:val="22"/>
+        </w:rPr>
+      </w:pPr>
+    </w:p>
+    <w:p>
+      <w:pPr>
+        <w:jc w:val="both"/>
+        <w:rPr>
+          <w:rFonts w:ascii="Arial" w:hAnsi="Arial" w:cs="Arial"/>
+          <w:color w:val="0070C0"/>
+          <w:sz w:val="22"/>
+          <w:szCs w:val="22"/>
+        </w:rPr>
+      </w:pPr>
+      <w:r>
+        <w:rPr>
+          <w:rFonts w:ascii="Arial" w:hAnsi="Arial" w:cs="Arial"/>
+          <w:color w:val="0070C0"/>
+          <w:sz w:val="22"/>
+          <w:szCs w:val="22"/>
+        </w:rPr>
+        <w:t>Casos de teste das classes inválidas:</w:t>
+      </w:r>
+    </w:p>
+    <w:p>
+      <w:pPr>
+        <w:pStyle w:val="PargrafodaLista"/>
+        <w:numPr>
+          <w:ilvl w:val="0"/>
+          <w:numId w:val="6"/>
+        </w:numPr>
+        <w:jc w:val="both"/>
+        <w:rPr>
+          <w:rFonts w:ascii="Arial" w:hAnsi="Arial" w:cs="Arial"/>
+          <w:color w:val="0070C0"/>
+          <w:sz w:val="22"/>
+          <w:szCs w:val="22"/>
+        </w:rPr>
+      </w:pPr>
+      <w:r>
+        <w:rPr>
+          <w:rFonts w:ascii="Arial" w:hAnsi="Arial" w:cs="Arial"/>
+          <w:color w:val="0070C0"/>
+          <w:sz w:val="22"/>
+          <w:szCs w:val="22"/>
+        </w:rPr>
+        <w:t>CT3(atinge classe 2)</w:t>
+      </w:r>
+    </w:p>
+    <w:p>
+      <w:pPr>
+        <w:pStyle w:val="PargrafodaLista"/>
+        <w:jc w:val="both"/>
+        <w:rPr>
+          <w:rFonts w:ascii="Arial" w:hAnsi="Arial" w:cs="Arial"/>
+          <w:color w:val="0070C0"/>
+          <w:sz w:val="22"/>
+          <w:szCs w:val="22"/>
+        </w:rPr>
+      </w:pPr>
+      <w:proofErr w:type="spellStart"/>
+      <w:proofErr w:type="gramStart"/>
+      <w:r>
+        <w:rPr>
+          <w:rFonts w:ascii="Arial" w:hAnsi="Arial" w:cs="Arial"/>
+          <w:color w:val="0070C0"/>
+          <w:sz w:val="22"/>
+          <w:szCs w:val="22"/>
+        </w:rPr>
+        <w:t>Int</w:t>
+      </w:r>
+      <w:proofErr w:type="spellEnd"/>
+      <w:r>
+        <w:rPr>
+          <w:rFonts w:ascii="Arial" w:hAnsi="Arial" w:cs="Arial"/>
+          <w:color w:val="0070C0"/>
+          <w:sz w:val="22"/>
+          <w:szCs w:val="22"/>
+        </w:rPr>
+        <w:t>[</w:t>
+      </w:r>
+      <w:proofErr w:type="gramEnd"/>
+      <w:r>
+        <w:rPr>
+          <w:rFonts w:ascii="Arial" w:hAnsi="Arial" w:cs="Arial"/>
+          <w:color w:val="0070C0"/>
+          <w:sz w:val="22"/>
+          <w:szCs w:val="22"/>
+        </w:rPr>
+        <w:t xml:space="preserve">] v3= new </w:t>
+      </w:r>
+      <w:proofErr w:type="spellStart"/>
+      <w:r>
+        <w:rPr>
+          <w:rFonts w:ascii="Arial" w:hAnsi="Arial" w:cs="Arial"/>
+          <w:color w:val="0070C0"/>
+          <w:sz w:val="22"/>
+          <w:szCs w:val="22"/>
+        </w:rPr>
+        <w:t>int</w:t>
+      </w:r>
+      <w:proofErr w:type="spellEnd"/>
+      <w:r>
+        <w:rPr>
+          <w:rFonts w:ascii="Arial" w:hAnsi="Arial" w:cs="Arial"/>
+          <w:color w:val="0070C0"/>
+          <w:sz w:val="22"/>
+          <w:szCs w:val="22"/>
+        </w:rPr>
+        <w:t>[50];</w:t>
+      </w:r>
+    </w:p>
+    <w:p>
+      <w:pPr>
+        <w:pStyle w:val="PargrafodaLista"/>
+        <w:jc w:val="both"/>
+        <w:rPr>
+          <w:rFonts w:ascii="Arial" w:hAnsi="Arial" w:cs="Arial"/>
+          <w:color w:val="0070C0"/>
+          <w:sz w:val="22"/>
+          <w:szCs w:val="22"/>
+        </w:rPr>
+      </w:pPr>
+      <w:proofErr w:type="spellStart"/>
+      <w:r>
+        <w:rPr>
+          <w:rFonts w:ascii="Arial" w:hAnsi="Arial" w:cs="Arial"/>
+          <w:color w:val="0070C0"/>
+          <w:sz w:val="22"/>
+          <w:szCs w:val="22"/>
+        </w:rPr>
+        <w:t>Int</w:t>
+      </w:r>
+      <w:proofErr w:type="spellEnd"/>
+      <w:r>
+        <w:rPr>
+          <w:rFonts w:ascii="Arial" w:hAnsi="Arial" w:cs="Arial"/>
+          <w:color w:val="0070C0"/>
+          <w:sz w:val="22"/>
+          <w:szCs w:val="22"/>
+        </w:rPr>
+        <w:t xml:space="preserve"> p3= </w:t>
+      </w:r>
+      <w:proofErr w:type="spellStart"/>
+      <w:proofErr w:type="gramStart"/>
+      <w:r>
+        <w:rPr>
+          <w:rFonts w:ascii="Arial" w:hAnsi="Arial" w:cs="Arial"/>
+          <w:color w:val="0070C0"/>
+          <w:sz w:val="22"/>
+          <w:szCs w:val="22"/>
+        </w:rPr>
+        <w:t>BuscaBinaria</w:t>
+      </w:r>
+      <w:proofErr w:type="spellEnd"/>
+      <w:r>
+        <w:rPr>
+          <w:rFonts w:ascii="Arial" w:hAnsi="Arial" w:cs="Arial"/>
+          <w:color w:val="0070C0"/>
+          <w:sz w:val="22"/>
+          <w:szCs w:val="22"/>
+        </w:rPr>
+        <w:t>(</w:t>
+      </w:r>
+      <w:proofErr w:type="gramEnd"/>
+      <w:r>
+        <w:rPr>
+          <w:rFonts w:ascii="Arial" w:hAnsi="Arial" w:cs="Arial"/>
+          <w:color w:val="0070C0"/>
+          <w:sz w:val="22"/>
+          <w:szCs w:val="22"/>
+        </w:rPr>
+        <w:t xml:space="preserve">v3,0, -1,5);//-1 </w:t>
+      </w:r>
+    </w:p>
+    <w:p>
+      <w:pPr>
+        <w:pStyle w:val="PargrafodaLista"/>
+        <w:numPr>
+          <w:ilvl w:val="0"/>
+          <w:numId w:val="6"/>
+        </w:numPr>
+        <w:jc w:val="both"/>
+        <w:rPr>
+          <w:rFonts w:ascii="Arial" w:hAnsi="Arial" w:cs="Arial"/>
+          <w:color w:val="0070C0"/>
+          <w:sz w:val="22"/>
+          <w:szCs w:val="22"/>
+        </w:rPr>
+      </w:pPr>
+      <w:r>
+        <w:rPr>
+          <w:rFonts w:ascii="Arial" w:hAnsi="Arial" w:cs="Arial"/>
+          <w:color w:val="0070C0"/>
+          <w:sz w:val="22"/>
+          <w:szCs w:val="22"/>
+        </w:rPr>
+        <w:t>CT4(atinge classe 4)</w:t>
+      </w:r>
+    </w:p>
+    <w:p>
+      <w:pPr>
+        <w:pStyle w:val="PargrafodaLista"/>
+        <w:jc w:val="both"/>
+        <w:rPr>
+          <w:rFonts w:ascii="Arial" w:hAnsi="Arial" w:cs="Arial"/>
+          <w:color w:val="0070C0"/>
+          <w:sz w:val="22"/>
+          <w:szCs w:val="22"/>
+        </w:rPr>
+      </w:pPr>
+      <w:proofErr w:type="spellStart"/>
+      <w:proofErr w:type="gramStart"/>
+      <w:r>
+        <w:rPr>
+          <w:rFonts w:ascii="Arial" w:hAnsi="Arial" w:cs="Arial"/>
+          <w:color w:val="0070C0"/>
+          <w:sz w:val="22"/>
+          <w:szCs w:val="22"/>
+        </w:rPr>
+        <w:t>Int</w:t>
+      </w:r>
+      <w:proofErr w:type="spellEnd"/>
+      <w:r>
+        <w:rPr>
+          <w:rFonts w:ascii="Arial" w:hAnsi="Arial" w:cs="Arial"/>
+          <w:color w:val="0070C0"/>
+          <w:sz w:val="22"/>
+          <w:szCs w:val="22"/>
+        </w:rPr>
+        <w:t>[</w:t>
+      </w:r>
+      <w:proofErr w:type="gramEnd"/>
+      <w:r>
+        <w:rPr>
+          <w:rFonts w:ascii="Arial" w:hAnsi="Arial" w:cs="Arial"/>
+          <w:color w:val="0070C0"/>
+          <w:sz w:val="22"/>
+          <w:szCs w:val="22"/>
+        </w:rPr>
+        <w:t>] v4;</w:t>
+      </w:r>
+    </w:p>
+    <w:p>
+      <w:pPr>
+        <w:pStyle w:val="PargrafodaLista"/>
+        <w:jc w:val="both"/>
+        <w:rPr>
+          <w:rFonts w:ascii="Arial" w:hAnsi="Arial" w:cs="Arial"/>
+          <w:color w:val="0070C0"/>
+          <w:sz w:val="22"/>
+          <w:szCs w:val="22"/>
+        </w:rPr>
+      </w:pPr>
+      <w:proofErr w:type="spellStart"/>
+      <w:r>
+        <w:rPr>
+          <w:rFonts w:ascii="Arial" w:hAnsi="Arial" w:cs="Arial"/>
+          <w:color w:val="0070C0"/>
+          <w:sz w:val="22"/>
+          <w:szCs w:val="22"/>
+        </w:rPr>
+        <w:t>Int</w:t>
+      </w:r>
+      <w:proofErr w:type="spellEnd"/>
+      <w:r>
+        <w:rPr>
+          <w:rFonts w:ascii="Arial" w:hAnsi="Arial" w:cs="Arial"/>
+          <w:color w:val="0070C0"/>
+          <w:sz w:val="22"/>
+          <w:szCs w:val="22"/>
+        </w:rPr>
+        <w:t xml:space="preserve"> p4= </w:t>
+      </w:r>
+      <w:proofErr w:type="spellStart"/>
+      <w:proofErr w:type="gramStart"/>
+      <w:r>
+        <w:rPr>
+          <w:rFonts w:ascii="Arial" w:hAnsi="Arial" w:cs="Arial"/>
+          <w:color w:val="0070C0"/>
+          <w:sz w:val="22"/>
+          <w:szCs w:val="22"/>
+        </w:rPr>
+        <w:t>BuscaBinaria</w:t>
+      </w:r>
+      <w:proofErr w:type="spellEnd"/>
+      <w:r>
+        <w:rPr>
+          <w:rFonts w:ascii="Arial" w:hAnsi="Arial" w:cs="Arial"/>
+          <w:color w:val="0070C0"/>
+          <w:sz w:val="22"/>
+          <w:szCs w:val="22"/>
+        </w:rPr>
+        <w:t>(</w:t>
+      </w:r>
+      <w:proofErr w:type="gramEnd"/>
+      <w:r>
+        <w:rPr>
+          <w:rFonts w:ascii="Arial" w:hAnsi="Arial" w:cs="Arial"/>
+          <w:color w:val="0070C0"/>
+          <w:sz w:val="22"/>
+          <w:szCs w:val="22"/>
+        </w:rPr>
+        <w:t>v3,0, -1,4);//??</w:t>
+      </w:r>
+    </w:p>
+    <w:p>
+      <w:pPr>
+        <w:pStyle w:val="PargrafodaLista"/>
+        <w:numPr>
+          <w:ilvl w:val="0"/>
+          <w:numId w:val="6"/>
+        </w:numPr>
+        <w:jc w:val="both"/>
+        <w:rPr>
+          <w:rFonts w:ascii="Arial" w:hAnsi="Arial" w:cs="Arial"/>
+          <w:color w:val="0070C0"/>
+          <w:sz w:val="22"/>
+          <w:szCs w:val="22"/>
+        </w:rPr>
+      </w:pPr>
+      <w:r>
+        <w:rPr>
+          <w:rFonts w:ascii="Arial" w:hAnsi="Arial" w:cs="Arial"/>
+          <w:color w:val="0070C0"/>
+          <w:sz w:val="22"/>
+          <w:szCs w:val="22"/>
+        </w:rPr>
+        <w:t>CT5(atinge classe 6)</w:t>
+      </w:r>
+    </w:p>
+    <w:p>
+      <w:pPr>
+        <w:pStyle w:val="PargrafodaLista"/>
+        <w:jc w:val="both"/>
+        <w:rPr>
+          <w:rFonts w:ascii="Arial" w:hAnsi="Arial" w:cs="Arial"/>
+          <w:color w:val="0070C0"/>
+          <w:sz w:val="22"/>
+          <w:szCs w:val="22"/>
+        </w:rPr>
+      </w:pPr>
+      <w:proofErr w:type="spellStart"/>
+      <w:proofErr w:type="gramStart"/>
+      <w:r>
+        <w:rPr>
+          <w:rFonts w:ascii="Arial" w:hAnsi="Arial" w:cs="Arial"/>
+          <w:color w:val="0070C0"/>
+          <w:sz w:val="22"/>
+          <w:szCs w:val="22"/>
+        </w:rPr>
+        <w:lastRenderedPageBreak/>
+        <w:t>Int</w:t>
+      </w:r>
+      <w:proofErr w:type="spellEnd"/>
+      <w:r>
+        <w:rPr>
+          <w:rFonts w:ascii="Arial" w:hAnsi="Arial" w:cs="Arial"/>
+          <w:color w:val="0070C0"/>
+          <w:sz w:val="22"/>
+          <w:szCs w:val="22"/>
+        </w:rPr>
+        <w:t>[</w:t>
+      </w:r>
+      <w:proofErr w:type="gramEnd"/>
+      <w:r>
+        <w:rPr>
+          <w:rFonts w:ascii="Arial" w:hAnsi="Arial" w:cs="Arial"/>
+          <w:color w:val="0070C0"/>
+          <w:sz w:val="22"/>
+          <w:szCs w:val="22"/>
+        </w:rPr>
+        <w:t xml:space="preserve">] v5 = new </w:t>
+      </w:r>
+      <w:proofErr w:type="spellStart"/>
+      <w:r>
+        <w:rPr>
+          <w:rFonts w:ascii="Arial" w:hAnsi="Arial" w:cs="Arial"/>
+          <w:color w:val="0070C0"/>
+          <w:sz w:val="22"/>
+          <w:szCs w:val="22"/>
+        </w:rPr>
+        <w:t>int</w:t>
+      </w:r>
+      <w:proofErr w:type="spellEnd"/>
+      <w:r>
+        <w:rPr>
+          <w:rFonts w:ascii="Arial" w:hAnsi="Arial" w:cs="Arial"/>
+          <w:color w:val="0070C0"/>
+          <w:sz w:val="22"/>
+          <w:szCs w:val="22"/>
+        </w:rPr>
+        <w:t>[50];</w:t>
+      </w:r>
+    </w:p>
+    <w:p>
+      <w:pPr>
+        <w:pStyle w:val="PargrafodaLista"/>
+        <w:jc w:val="both"/>
+        <w:rPr>
+          <w:rFonts w:ascii="Arial" w:hAnsi="Arial" w:cs="Arial"/>
+          <w:color w:val="0070C0"/>
+          <w:sz w:val="22"/>
+          <w:szCs w:val="22"/>
+        </w:rPr>
+      </w:pPr>
+      <w:r>
+        <w:rPr>
+          <w:rFonts w:ascii="Arial" w:hAnsi="Arial" w:cs="Arial"/>
+          <w:color w:val="0070C0"/>
+          <w:sz w:val="22"/>
+          <w:szCs w:val="22"/>
+        </w:rPr>
+        <w:t>V</w:t>
+      </w:r>
+      <w:r>
+        <w:rPr>
+          <w:rFonts w:ascii="Arial" w:hAnsi="Arial" w:cs="Arial"/>
+          <w:color w:val="0070C0"/>
+          <w:sz w:val="22"/>
+          <w:szCs w:val="22"/>
+        </w:rPr>
+        <w:t>5</w:t>
+      </w:r>
+      <w:r>
+        <w:rPr>
+          <w:rFonts w:ascii="Arial" w:hAnsi="Arial" w:cs="Arial"/>
+          <w:color w:val="0070C0"/>
+          <w:sz w:val="22"/>
+          <w:szCs w:val="22"/>
+        </w:rPr>
+        <w:t>[</w:t>
+      </w:r>
+      <w:proofErr w:type="gramStart"/>
+      <w:r>
+        <w:rPr>
+          <w:rFonts w:ascii="Arial" w:hAnsi="Arial" w:cs="Arial"/>
+          <w:color w:val="0070C0"/>
+          <w:sz w:val="22"/>
+          <w:szCs w:val="22"/>
+        </w:rPr>
+        <w:t>0]=</w:t>
+      </w:r>
+      <w:proofErr w:type="gramEnd"/>
+      <w:r>
+        <w:rPr>
+          <w:rFonts w:ascii="Arial" w:hAnsi="Arial" w:cs="Arial"/>
+          <w:color w:val="0070C0"/>
+          <w:sz w:val="22"/>
+          <w:szCs w:val="22"/>
+        </w:rPr>
+        <w:t xml:space="preserve"> -4;</w:t>
+      </w:r>
+    </w:p>
+    <w:p>
+      <w:pPr>
+        <w:pStyle w:val="PargrafodaLista"/>
+        <w:jc w:val="both"/>
+        <w:rPr>
+          <w:rFonts w:ascii="Arial" w:hAnsi="Arial" w:cs="Arial"/>
+          <w:color w:val="0070C0"/>
+          <w:sz w:val="22"/>
+          <w:szCs w:val="22"/>
+        </w:rPr>
+      </w:pPr>
+      <w:r>
+        <w:rPr>
+          <w:rFonts w:ascii="Arial" w:hAnsi="Arial" w:cs="Arial"/>
+          <w:color w:val="0070C0"/>
+          <w:sz w:val="22"/>
+          <w:szCs w:val="22"/>
+        </w:rPr>
+        <w:t>V</w:t>
+      </w:r>
+      <w:r>
+        <w:rPr>
+          <w:rFonts w:ascii="Arial" w:hAnsi="Arial" w:cs="Arial"/>
+          <w:color w:val="0070C0"/>
+          <w:sz w:val="22"/>
+          <w:szCs w:val="22"/>
+        </w:rPr>
+        <w:t>5</w:t>
+      </w:r>
+      <w:r>
+        <w:rPr>
+          <w:rFonts w:ascii="Arial" w:hAnsi="Arial" w:cs="Arial"/>
+          <w:color w:val="0070C0"/>
+          <w:sz w:val="22"/>
+          <w:szCs w:val="22"/>
+        </w:rPr>
+        <w:t>[</w:t>
+      </w:r>
+      <w:proofErr w:type="gramStart"/>
+      <w:r>
+        <w:rPr>
+          <w:rFonts w:ascii="Arial" w:hAnsi="Arial" w:cs="Arial"/>
+          <w:color w:val="0070C0"/>
+          <w:sz w:val="22"/>
+          <w:szCs w:val="22"/>
+        </w:rPr>
+        <w:t>1]=</w:t>
+      </w:r>
+      <w:proofErr w:type="gramEnd"/>
+      <w:r>
+        <w:rPr>
+          <w:rFonts w:ascii="Arial" w:hAnsi="Arial" w:cs="Arial"/>
+          <w:color w:val="0070C0"/>
+          <w:sz w:val="22"/>
+          <w:szCs w:val="22"/>
+        </w:rPr>
+        <w:t xml:space="preserve"> 3;</w:t>
+      </w:r>
+    </w:p>
+    <w:p>
+      <w:pPr>
+        <w:pStyle w:val="PargrafodaLista"/>
+        <w:jc w:val="both"/>
+        <w:rPr>
+          <w:rFonts w:ascii="Arial" w:hAnsi="Arial" w:cs="Arial"/>
+          <w:color w:val="0070C0"/>
+          <w:sz w:val="22"/>
+          <w:szCs w:val="22"/>
+        </w:rPr>
+      </w:pPr>
+      <w:r>
+        <w:rPr>
+          <w:rFonts w:ascii="Arial" w:hAnsi="Arial" w:cs="Arial"/>
+          <w:color w:val="0070C0"/>
+          <w:sz w:val="22"/>
+          <w:szCs w:val="22"/>
+        </w:rPr>
+        <w:t>V</w:t>
+      </w:r>
+      <w:r>
+        <w:rPr>
+          <w:rFonts w:ascii="Arial" w:hAnsi="Arial" w:cs="Arial"/>
+          <w:color w:val="0070C0"/>
+          <w:sz w:val="22"/>
+          <w:szCs w:val="22"/>
+        </w:rPr>
+        <w:t>5</w:t>
+      </w:r>
+      <w:r>
+        <w:rPr>
+          <w:rFonts w:ascii="Arial" w:hAnsi="Arial" w:cs="Arial"/>
+          <w:color w:val="0070C0"/>
+          <w:sz w:val="22"/>
+          <w:szCs w:val="22"/>
+        </w:rPr>
+        <w:t>[</w:t>
+      </w:r>
+      <w:proofErr w:type="gramStart"/>
+      <w:r>
+        <w:rPr>
+          <w:rFonts w:ascii="Arial" w:hAnsi="Arial" w:cs="Arial"/>
+          <w:color w:val="0070C0"/>
+          <w:sz w:val="22"/>
+          <w:szCs w:val="22"/>
+        </w:rPr>
+        <w:t>2]=</w:t>
+      </w:r>
+      <w:proofErr w:type="gramEnd"/>
+      <w:r>
+        <w:rPr>
+          <w:rFonts w:ascii="Arial" w:hAnsi="Arial" w:cs="Arial"/>
+          <w:color w:val="0070C0"/>
+          <w:sz w:val="22"/>
+          <w:szCs w:val="22"/>
+        </w:rPr>
+        <w:t xml:space="preserve"> 14;</w:t>
+      </w:r>
+    </w:p>
+    <w:p>
+      <w:pPr>
+        <w:pStyle w:val="PargrafodaLista"/>
+        <w:jc w:val="both"/>
+        <w:rPr>
+          <w:rFonts w:ascii="Arial" w:hAnsi="Arial" w:cs="Arial"/>
+          <w:color w:val="0070C0"/>
+          <w:sz w:val="22"/>
+          <w:szCs w:val="22"/>
+        </w:rPr>
+      </w:pPr>
+      <w:r>
+        <w:rPr>
+          <w:rFonts w:ascii="Arial" w:hAnsi="Arial" w:cs="Arial"/>
+          <w:color w:val="0070C0"/>
+          <w:sz w:val="22"/>
+          <w:szCs w:val="22"/>
+        </w:rPr>
+        <w:t>V</w:t>
+      </w:r>
+      <w:r>
+        <w:rPr>
+          <w:rFonts w:ascii="Arial" w:hAnsi="Arial" w:cs="Arial"/>
+          <w:color w:val="0070C0"/>
+          <w:sz w:val="22"/>
+          <w:szCs w:val="22"/>
+        </w:rPr>
+        <w:t>5</w:t>
+      </w:r>
+      <w:r>
+        <w:rPr>
+          <w:rFonts w:ascii="Arial" w:hAnsi="Arial" w:cs="Arial"/>
+          <w:color w:val="0070C0"/>
+          <w:sz w:val="22"/>
+          <w:szCs w:val="22"/>
+        </w:rPr>
+        <w:t>[</w:t>
+      </w:r>
+      <w:proofErr w:type="gramStart"/>
+      <w:r>
+        <w:rPr>
+          <w:rFonts w:ascii="Arial" w:hAnsi="Arial" w:cs="Arial"/>
+          <w:color w:val="0070C0"/>
+          <w:sz w:val="22"/>
+          <w:szCs w:val="22"/>
+        </w:rPr>
+        <w:t>3]=</w:t>
+      </w:r>
+      <w:proofErr w:type="gramEnd"/>
+      <w:r>
+        <w:rPr>
+          <w:rFonts w:ascii="Arial" w:hAnsi="Arial" w:cs="Arial"/>
+          <w:color w:val="0070C0"/>
+          <w:sz w:val="22"/>
+          <w:szCs w:val="22"/>
+        </w:rPr>
+        <w:t xml:space="preserve"> 31;</w:t>
+      </w:r>
+    </w:p>
+    <w:p>
+      <w:pPr>
+        <w:pStyle w:val="PargrafodaLista"/>
+        <w:jc w:val="both"/>
+        <w:rPr>
+          <w:rFonts w:ascii="Arial" w:hAnsi="Arial" w:cs="Arial"/>
+          <w:color w:val="0070C0"/>
+          <w:sz w:val="22"/>
+          <w:szCs w:val="22"/>
+        </w:rPr>
+      </w:pPr>
+      <w:r>
+        <w:rPr>
+          <w:rFonts w:ascii="Arial" w:hAnsi="Arial" w:cs="Arial"/>
+          <w:color w:val="0070C0"/>
+          <w:sz w:val="22"/>
+          <w:szCs w:val="22"/>
+        </w:rPr>
+        <w:t>V</w:t>
+      </w:r>
+      <w:r>
+        <w:rPr>
+          <w:rFonts w:ascii="Arial" w:hAnsi="Arial" w:cs="Arial"/>
+          <w:color w:val="0070C0"/>
+          <w:sz w:val="22"/>
+          <w:szCs w:val="22"/>
+        </w:rPr>
+        <w:t>5</w:t>
+      </w:r>
+      <w:r>
+        <w:rPr>
+          <w:rFonts w:ascii="Arial" w:hAnsi="Arial" w:cs="Arial"/>
+          <w:color w:val="0070C0"/>
+          <w:sz w:val="22"/>
+          <w:szCs w:val="22"/>
+        </w:rPr>
+        <w:t>[</w:t>
+      </w:r>
+      <w:proofErr w:type="gramStart"/>
+      <w:r>
+        <w:rPr>
+          <w:rFonts w:ascii="Arial" w:hAnsi="Arial" w:cs="Arial"/>
+          <w:color w:val="0070C0"/>
+          <w:sz w:val="22"/>
+          <w:szCs w:val="22"/>
+        </w:rPr>
+        <w:t>4]=</w:t>
+      </w:r>
+      <w:proofErr w:type="gramEnd"/>
+      <w:r>
+        <w:rPr>
+          <w:rFonts w:ascii="Arial" w:hAnsi="Arial" w:cs="Arial"/>
+          <w:color w:val="0070C0"/>
+          <w:sz w:val="22"/>
+          <w:szCs w:val="22"/>
+        </w:rPr>
+        <w:t xml:space="preserve"> 56;</w:t>
+      </w:r>
+    </w:p>
+    <w:p>
+      <w:pPr>
+        <w:pStyle w:val="PargrafodaLista"/>
+        <w:jc w:val="both"/>
+        <w:rPr>
+          <w:rFonts w:ascii="Arial" w:hAnsi="Arial" w:cs="Arial"/>
+          <w:color w:val="0070C0"/>
+          <w:sz w:val="22"/>
+          <w:szCs w:val="22"/>
+        </w:rPr>
+      </w:pPr>
+      <w:proofErr w:type="spellStart"/>
+      <w:r>
+        <w:rPr>
+          <w:rFonts w:ascii="Arial" w:hAnsi="Arial" w:cs="Arial"/>
+          <w:color w:val="0070C0"/>
+          <w:sz w:val="22"/>
+          <w:szCs w:val="22"/>
+        </w:rPr>
+        <w:t>Int</w:t>
+      </w:r>
+      <w:proofErr w:type="spellEnd"/>
+      <w:r>
+        <w:rPr>
+          <w:rFonts w:ascii="Arial" w:hAnsi="Arial" w:cs="Arial"/>
+          <w:color w:val="0070C0"/>
+          <w:sz w:val="22"/>
+          <w:szCs w:val="22"/>
+        </w:rPr>
+        <w:t xml:space="preserve"> p</w:t>
+      </w:r>
+      <w:r>
+        <w:rPr>
+          <w:rFonts w:ascii="Arial" w:hAnsi="Arial" w:cs="Arial"/>
+          <w:color w:val="0070C0"/>
+          <w:sz w:val="22"/>
+          <w:szCs w:val="22"/>
+        </w:rPr>
+        <w:t>5</w:t>
+      </w:r>
+      <w:r>
+        <w:rPr>
+          <w:rFonts w:ascii="Arial" w:hAnsi="Arial" w:cs="Arial"/>
+          <w:color w:val="0070C0"/>
+          <w:sz w:val="22"/>
+          <w:szCs w:val="22"/>
+        </w:rPr>
+        <w:t xml:space="preserve"> = </w:t>
+      </w:r>
+      <w:proofErr w:type="spellStart"/>
+      <w:proofErr w:type="gramStart"/>
+      <w:r>
+        <w:rPr>
+          <w:rFonts w:ascii="Arial" w:hAnsi="Arial" w:cs="Arial"/>
+          <w:color w:val="0070C0"/>
+          <w:sz w:val="22"/>
+          <w:szCs w:val="22"/>
+        </w:rPr>
+        <w:t>BuscaBinaria</w:t>
+      </w:r>
+      <w:proofErr w:type="spellEnd"/>
+      <w:r>
+        <w:rPr>
+          <w:rFonts w:ascii="Arial" w:hAnsi="Arial" w:cs="Arial"/>
+          <w:color w:val="0070C0"/>
+          <w:sz w:val="22"/>
+          <w:szCs w:val="22"/>
+        </w:rPr>
+        <w:t>(</w:t>
+      </w:r>
+      <w:proofErr w:type="gramEnd"/>
+      <w:r>
+        <w:rPr>
+          <w:rFonts w:ascii="Arial" w:hAnsi="Arial" w:cs="Arial"/>
+          <w:color w:val="0070C0"/>
+          <w:sz w:val="22"/>
+          <w:szCs w:val="22"/>
+        </w:rPr>
+        <w:t>v</w:t>
+      </w:r>
+      <w:r>
+        <w:rPr>
+          <w:rFonts w:ascii="Arial" w:hAnsi="Arial" w:cs="Arial"/>
+          <w:color w:val="0070C0"/>
+          <w:sz w:val="22"/>
+          <w:szCs w:val="22"/>
+        </w:rPr>
+        <w:t>5</w:t>
+      </w:r>
+      <w:r>
+        <w:rPr>
+          <w:rFonts w:ascii="Arial" w:hAnsi="Arial" w:cs="Arial"/>
+          <w:color w:val="0070C0"/>
+          <w:sz w:val="22"/>
+          <w:szCs w:val="22"/>
+        </w:rPr>
+        <w:t>, 0, 4, 3</w:t>
+      </w:r>
+      <w:r>
+        <w:rPr>
+          <w:rFonts w:ascii="Arial" w:hAnsi="Arial" w:cs="Arial"/>
+          <w:color w:val="0070C0"/>
+          <w:sz w:val="22"/>
+          <w:szCs w:val="22"/>
+        </w:rPr>
+        <w:t>7</w:t>
+      </w:r>
+      <w:r>
+        <w:rPr>
+          <w:rFonts w:ascii="Arial" w:hAnsi="Arial" w:cs="Arial"/>
+          <w:color w:val="0070C0"/>
+          <w:sz w:val="22"/>
+          <w:szCs w:val="22"/>
+        </w:rPr>
+        <w:t>); //</w:t>
+      </w:r>
+      <w:r>
+        <w:rPr>
+          <w:rFonts w:ascii="Arial" w:hAnsi="Arial" w:cs="Arial"/>
+          <w:color w:val="0070C0"/>
+          <w:sz w:val="22"/>
+          <w:szCs w:val="22"/>
+        </w:rPr>
+        <w:t xml:space="preserve"> retorna um valor que pode não ser o esperado.</w:t>
+      </w:r>
+    </w:p>
+    <w:p>
+      <w:pPr>
+        <w:pStyle w:val="PargrafodaLista"/>
+        <w:numPr>
+          <w:ilvl w:val="0"/>
+          <w:numId w:val="6"/>
+        </w:numPr>
+        <w:jc w:val="both"/>
+        <w:rPr>
+          <w:rFonts w:ascii="Arial" w:hAnsi="Arial" w:cs="Arial"/>
+          <w:color w:val="FF0000"/>
+          <w:sz w:val="22"/>
+          <w:szCs w:val="22"/>
+        </w:rPr>
+      </w:pPr>
+      <w:r>
+        <w:rPr>
+          <w:rFonts w:ascii="Arial" w:hAnsi="Arial" w:cs="Arial"/>
+          <w:color w:val="0070C0"/>
+          <w:sz w:val="22"/>
+          <w:szCs w:val="22"/>
+        </w:rPr>
+        <w:t xml:space="preserve">CT6 em diante para </w:t>
+      </w:r>
+      <w:r>
+        <w:rPr>
+          <w:rFonts w:ascii="Arial" w:hAnsi="Arial" w:cs="Arial"/>
+          <w:color w:val="FF0000"/>
+          <w:sz w:val="22"/>
+          <w:szCs w:val="22"/>
+        </w:rPr>
+        <w:t>CASA</w:t>
+      </w:r>
+    </w:p>
+    <w:p>
+      <w:pPr>
+        <w:pStyle w:val="PargrafodaLista"/>
+        <w:jc w:val="both"/>
+        <w:rPr>
+          <w:rFonts w:ascii="Arial" w:hAnsi="Arial" w:cs="Arial"/>
+          <w:color w:val="0070C0"/>
+          <w:sz w:val="22"/>
+          <w:szCs w:val="22"/>
+        </w:rPr>
+      </w:pPr>
+    </w:p>
+    <w:p>
+      <w:pPr>
+        <w:pStyle w:val="PargrafodaLista"/>
+        <w:jc w:val="both"/>
+        <w:rPr>
+          <w:rFonts w:ascii="Arial" w:hAnsi="Arial" w:cs="Arial"/>
+          <w:color w:val="0070C0"/>
+          <w:sz w:val="22"/>
+          <w:szCs w:val="22"/>
+        </w:rPr>
+      </w:pPr>
+    </w:p>
+    <w:p>
+      <w:pPr>
+        <w:pStyle w:val="PargrafodaLista"/>
+        <w:jc w:val="both"/>
+        <w:rPr>
+          <w:rFonts w:ascii="Arial" w:hAnsi="Arial" w:cs="Arial"/>
+          <w:color w:val="0070C0"/>
+          <w:sz w:val="22"/>
+          <w:szCs w:val="22"/>
+        </w:rPr>
+      </w:pPr>
+    </w:p>
+    <w:p>
+      <w:pPr>
+        <w:jc w:val="both"/>
+        <w:rPr>
+          <w:rFonts w:ascii="Arial" w:hAnsi="Arial" w:cs="Arial"/>
+          <w:sz w:val="22"/>
+          <w:szCs w:val="22"/>
+        </w:rPr>
+      </w:pPr>
+    </w:p>
+    <w:p>
+      <w:pPr>
+        <w:pStyle w:val="PargrafodaLista"/>
+        <w:jc w:val="both"/>
+        <w:rPr>
+          <w:rFonts w:ascii="Arial" w:hAnsi="Arial" w:cs="Arial"/>
+          <w:sz w:val="22"/>
+          <w:szCs w:val="22"/>
+        </w:rPr>
+      </w:pPr>
+    </w:p>
+    <w:p>
+      <w:pPr>
+        <w:pStyle w:val="PargrafodaLista"/>
         <w:jc w:val="both"/>
         <w:rPr>
           <w:rFonts w:ascii="Arial" w:hAnsi="Arial" w:cs="Arial"/>
@@ -11598,7 +15006,6 @@
                 <w:sz w:val="22"/>
                 <w:szCs w:val="22"/>
               </w:rPr>
-              <w:lastRenderedPageBreak/>
               <w:drawing>
                 <wp:inline distT="0" distB="0" distL="0" distR="0" wp14:anchorId="6FF4CF87" wp14:editId="1DCA7285">
                   <wp:extent cx="3035300" cy="1879600"/>
@@ -11815,6 +15222,8 @@
               </w:rPr>
               <w:t xml:space="preserve"> e </w:t>
             </w:r>
+            <w:bookmarkStart w:id="0" w:name="_GoBack"/>
+            <w:bookmarkEnd w:id="0"/>
             <w:r>
               <w:rPr>
                 <w:rFonts w:ascii="Arial" w:hAnsi="Arial" w:cs="Arial"/>
@@ -11856,21 +15265,449 @@
         </w:rPr>
       </w:pPr>
     </w:p>
-    <w:p>
-      <w:pPr>
-        <w:rPr>
-          <w:rFonts w:ascii="Arial" w:hAnsi="Arial" w:cs="Arial"/>
-          <w:color w:val="0070C0"/>
-        </w:rPr>
-      </w:pPr>
-    </w:p>
-    <w:p>
-      <w:pPr>
-        <w:rPr>
-          <w:rFonts w:ascii="Arial" w:hAnsi="Arial" w:cs="Arial"/>
-          <w:color w:val="0070C0"/>
-        </w:rPr>
-      </w:pPr>
+    <w:tbl>
+      <w:tblPr>
+        <w:tblStyle w:val="Tabelacomgrade"/>
+        <w:tblW w:w="0" w:type="auto"/>
+        <w:tblLook w:val="04A0" w:firstRow="1" w:lastRow="0" w:firstColumn="1" w:lastColumn="0" w:noHBand="0" w:noVBand="1"/>
+      </w:tblPr>
+      <w:tblGrid>
+        <w:gridCol w:w="3635"/>
+        <w:gridCol w:w="3636"/>
+        <w:gridCol w:w="3636"/>
+      </w:tblGrid>
+      <w:tr>
+        <w:tc>
+          <w:tcPr>
+            <w:tcW w:w="3635" w:type="dxa"/>
+          </w:tcPr>
+          <w:p>
+            <w:pPr>
+              <w:jc w:val="both"/>
+              <w:rPr>
+                <w:rFonts w:ascii="Arial" w:hAnsi="Arial" w:cs="Arial"/>
+                <w:b/>
+                <w:sz w:val="22"/>
+                <w:szCs w:val="22"/>
+              </w:rPr>
+            </w:pPr>
+            <w:r>
+              <w:rPr>
+                <w:rFonts w:ascii="Arial" w:hAnsi="Arial" w:cs="Arial"/>
+                <w:b/>
+                <w:sz w:val="22"/>
+                <w:szCs w:val="22"/>
+              </w:rPr>
+              <w:t>Condições de Entrada</w:t>
+            </w:r>
+          </w:p>
+        </w:tc>
+        <w:tc>
+          <w:tcPr>
+            <w:tcW w:w="3636" w:type="dxa"/>
+          </w:tcPr>
+          <w:p>
+            <w:pPr>
+              <w:jc w:val="both"/>
+              <w:rPr>
+                <w:rFonts w:ascii="Arial" w:hAnsi="Arial" w:cs="Arial"/>
+                <w:b/>
+                <w:sz w:val="22"/>
+                <w:szCs w:val="22"/>
+              </w:rPr>
+            </w:pPr>
+            <w:r>
+              <w:rPr>
+                <w:rFonts w:ascii="Arial" w:hAnsi="Arial" w:cs="Arial"/>
+                <w:b/>
+                <w:sz w:val="22"/>
+                <w:szCs w:val="22"/>
+              </w:rPr>
+              <w:t>Classes Válidas</w:t>
+            </w:r>
+          </w:p>
+        </w:tc>
+        <w:tc>
+          <w:tcPr>
+            <w:tcW w:w="3636" w:type="dxa"/>
+          </w:tcPr>
+          <w:p>
+            <w:pPr>
+              <w:jc w:val="both"/>
+              <w:rPr>
+                <w:rFonts w:ascii="Arial" w:hAnsi="Arial" w:cs="Arial"/>
+                <w:b/>
+                <w:sz w:val="22"/>
+                <w:szCs w:val="22"/>
+              </w:rPr>
+            </w:pPr>
+            <w:r>
+              <w:rPr>
+                <w:rFonts w:ascii="Arial" w:hAnsi="Arial" w:cs="Arial"/>
+                <w:b/>
+                <w:sz w:val="22"/>
+                <w:szCs w:val="22"/>
+              </w:rPr>
+              <w:t>Classes Inválidas</w:t>
+            </w:r>
+          </w:p>
+        </w:tc>
+      </w:tr>
+      <w:tr>
+        <w:tc>
+          <w:tcPr>
+            <w:tcW w:w="3635" w:type="dxa"/>
+          </w:tcPr>
+          <w:p>
+            <w:pPr>
+              <w:rPr>
+                <w:rFonts w:ascii="Arial" w:hAnsi="Arial" w:cs="Arial"/>
+                <w:sz w:val="22"/>
+                <w:szCs w:val="22"/>
+              </w:rPr>
+            </w:pPr>
+            <w:r>
+              <w:rPr>
+                <w:rFonts w:ascii="Arial" w:hAnsi="Arial" w:cs="Arial"/>
+                <w:sz w:val="22"/>
+                <w:szCs w:val="22"/>
+              </w:rPr>
+              <w:t xml:space="preserve">Usuário está </w:t>
+            </w:r>
+            <w:proofErr w:type="gramStart"/>
+            <w:r>
+              <w:rPr>
+                <w:rFonts w:ascii="Arial" w:hAnsi="Arial" w:cs="Arial"/>
+                <w:sz w:val="22"/>
+                <w:szCs w:val="22"/>
+              </w:rPr>
+              <w:t>cadastrado(</w:t>
+            </w:r>
+            <w:proofErr w:type="gramEnd"/>
+            <w:r>
+              <w:rPr>
+                <w:rFonts w:ascii="Arial" w:hAnsi="Arial" w:cs="Arial"/>
+                <w:sz w:val="22"/>
+                <w:szCs w:val="22"/>
+              </w:rPr>
+              <w:t>condição booleana)</w:t>
+            </w:r>
+          </w:p>
+        </w:tc>
+        <w:tc>
+          <w:tcPr>
+            <w:tcW w:w="3636" w:type="dxa"/>
+          </w:tcPr>
+          <w:p>
+            <w:pPr>
+              <w:jc w:val="both"/>
+              <w:rPr>
+                <w:rFonts w:ascii="Arial" w:hAnsi="Arial" w:cs="Arial"/>
+                <w:sz w:val="22"/>
+                <w:szCs w:val="22"/>
+              </w:rPr>
+            </w:pPr>
+            <w:proofErr w:type="gramStart"/>
+            <w:r>
+              <w:rPr>
+                <w:rFonts w:ascii="Arial" w:hAnsi="Arial" w:cs="Arial"/>
+                <w:sz w:val="22"/>
+                <w:szCs w:val="22"/>
+              </w:rPr>
+              <w:t>Sim(</w:t>
+            </w:r>
+            <w:proofErr w:type="gramEnd"/>
+            <w:r>
+              <w:rPr>
+                <w:rFonts w:ascii="Arial" w:hAnsi="Arial" w:cs="Arial"/>
+                <w:sz w:val="22"/>
+                <w:szCs w:val="22"/>
+              </w:rPr>
+              <w:t>1)</w:t>
+            </w:r>
+          </w:p>
+        </w:tc>
+        <w:tc>
+          <w:tcPr>
+            <w:tcW w:w="3636" w:type="dxa"/>
+          </w:tcPr>
+          <w:p>
+            <w:pPr>
+              <w:jc w:val="both"/>
+              <w:rPr>
+                <w:rFonts w:ascii="Arial" w:hAnsi="Arial" w:cs="Arial"/>
+                <w:sz w:val="22"/>
+                <w:szCs w:val="22"/>
+              </w:rPr>
+            </w:pPr>
+            <w:proofErr w:type="gramStart"/>
+            <w:r>
+              <w:rPr>
+                <w:rFonts w:ascii="Arial" w:hAnsi="Arial" w:cs="Arial"/>
+                <w:sz w:val="22"/>
+                <w:szCs w:val="22"/>
+              </w:rPr>
+              <w:t>Não(</w:t>
+            </w:r>
+            <w:proofErr w:type="gramEnd"/>
+            <w:r>
+              <w:rPr>
+                <w:rFonts w:ascii="Arial" w:hAnsi="Arial" w:cs="Arial"/>
+                <w:sz w:val="22"/>
+                <w:szCs w:val="22"/>
+              </w:rPr>
+              <w:t>2)</w:t>
+            </w:r>
+          </w:p>
+        </w:tc>
+      </w:tr>
+      <w:tr>
+        <w:tc>
+          <w:tcPr>
+            <w:tcW w:w="3635" w:type="dxa"/>
+          </w:tcPr>
+          <w:p>
+            <w:pPr>
+              <w:rPr>
+                <w:rFonts w:ascii="Arial" w:hAnsi="Arial" w:cs="Arial"/>
+                <w:sz w:val="22"/>
+                <w:szCs w:val="22"/>
+              </w:rPr>
+            </w:pPr>
+            <w:r>
+              <w:rPr>
+                <w:rFonts w:ascii="Arial" w:hAnsi="Arial" w:cs="Arial"/>
+                <w:sz w:val="22"/>
+                <w:szCs w:val="22"/>
+              </w:rPr>
+              <w:t xml:space="preserve">Senha está </w:t>
+            </w:r>
+            <w:proofErr w:type="gramStart"/>
+            <w:r>
+              <w:rPr>
+                <w:rFonts w:ascii="Arial" w:hAnsi="Arial" w:cs="Arial"/>
+                <w:sz w:val="22"/>
+                <w:szCs w:val="22"/>
+              </w:rPr>
+              <w:t>correta(</w:t>
+            </w:r>
+            <w:proofErr w:type="gramEnd"/>
+            <w:r>
+              <w:rPr>
+                <w:rFonts w:ascii="Arial" w:hAnsi="Arial" w:cs="Arial"/>
+                <w:sz w:val="22"/>
+                <w:szCs w:val="22"/>
+              </w:rPr>
+              <w:t>condição booleana)</w:t>
+            </w:r>
+          </w:p>
+        </w:tc>
+        <w:tc>
+          <w:tcPr>
+            <w:tcW w:w="3636" w:type="dxa"/>
+          </w:tcPr>
+          <w:p>
+            <w:pPr>
+              <w:jc w:val="both"/>
+              <w:rPr>
+                <w:rFonts w:ascii="Arial" w:hAnsi="Arial" w:cs="Arial"/>
+                <w:sz w:val="22"/>
+                <w:szCs w:val="22"/>
+              </w:rPr>
+            </w:pPr>
+            <w:proofErr w:type="gramStart"/>
+            <w:r>
+              <w:rPr>
+                <w:rFonts w:ascii="Arial" w:hAnsi="Arial" w:cs="Arial"/>
+                <w:sz w:val="22"/>
+                <w:szCs w:val="22"/>
+              </w:rPr>
+              <w:t>Sim(</w:t>
+            </w:r>
+            <w:proofErr w:type="gramEnd"/>
+            <w:r>
+              <w:rPr>
+                <w:rFonts w:ascii="Arial" w:hAnsi="Arial" w:cs="Arial"/>
+                <w:sz w:val="22"/>
+                <w:szCs w:val="22"/>
+              </w:rPr>
+              <w:t>3)</w:t>
+            </w:r>
+          </w:p>
+        </w:tc>
+        <w:tc>
+          <w:tcPr>
+            <w:tcW w:w="3636" w:type="dxa"/>
+          </w:tcPr>
+          <w:p>
+            <w:pPr>
+              <w:jc w:val="both"/>
+              <w:rPr>
+                <w:rFonts w:ascii="Arial" w:hAnsi="Arial" w:cs="Arial"/>
+                <w:sz w:val="22"/>
+                <w:szCs w:val="22"/>
+              </w:rPr>
+            </w:pPr>
+            <w:proofErr w:type="gramStart"/>
+            <w:r>
+              <w:rPr>
+                <w:rFonts w:ascii="Arial" w:hAnsi="Arial" w:cs="Arial"/>
+                <w:sz w:val="22"/>
+                <w:szCs w:val="22"/>
+              </w:rPr>
+              <w:t>Não(</w:t>
+            </w:r>
+            <w:proofErr w:type="gramEnd"/>
+            <w:r>
+              <w:rPr>
+                <w:rFonts w:ascii="Arial" w:hAnsi="Arial" w:cs="Arial"/>
+                <w:sz w:val="22"/>
+                <w:szCs w:val="22"/>
+              </w:rPr>
+              <w:t>4)</w:t>
+            </w:r>
+          </w:p>
+        </w:tc>
+      </w:tr>
+      <w:tr>
+        <w:tc>
+          <w:tcPr>
+            <w:tcW w:w="3635" w:type="dxa"/>
+          </w:tcPr>
+          <w:p>
+            <w:pPr>
+              <w:rPr>
+                <w:rFonts w:ascii="Arial" w:hAnsi="Arial" w:cs="Arial"/>
+                <w:sz w:val="22"/>
+                <w:szCs w:val="22"/>
+              </w:rPr>
+            </w:pPr>
+            <w:r>
+              <w:rPr>
+                <w:rFonts w:ascii="Arial" w:hAnsi="Arial" w:cs="Arial"/>
+                <w:sz w:val="22"/>
+                <w:szCs w:val="22"/>
+              </w:rPr>
+              <w:t xml:space="preserve">Usuário tem acesso ao </w:t>
+            </w:r>
+            <w:proofErr w:type="gramStart"/>
+            <w:r>
+              <w:rPr>
+                <w:rFonts w:ascii="Arial" w:hAnsi="Arial" w:cs="Arial"/>
+                <w:sz w:val="22"/>
+                <w:szCs w:val="22"/>
+              </w:rPr>
+              <w:t>módulo(</w:t>
+            </w:r>
+            <w:proofErr w:type="gramEnd"/>
+            <w:r>
+              <w:rPr>
+                <w:rFonts w:ascii="Arial" w:hAnsi="Arial" w:cs="Arial"/>
+                <w:sz w:val="22"/>
+                <w:szCs w:val="22"/>
+              </w:rPr>
+              <w:t>condição booleana)</w:t>
+            </w:r>
+          </w:p>
+        </w:tc>
+        <w:tc>
+          <w:tcPr>
+            <w:tcW w:w="3636" w:type="dxa"/>
+          </w:tcPr>
+          <w:p>
+            <w:pPr>
+              <w:jc w:val="both"/>
+              <w:rPr>
+                <w:rFonts w:ascii="Arial" w:hAnsi="Arial" w:cs="Arial"/>
+                <w:sz w:val="22"/>
+                <w:szCs w:val="22"/>
+              </w:rPr>
+            </w:pPr>
+            <w:proofErr w:type="gramStart"/>
+            <w:r>
+              <w:rPr>
+                <w:rFonts w:ascii="Arial" w:hAnsi="Arial" w:cs="Arial"/>
+                <w:sz w:val="22"/>
+                <w:szCs w:val="22"/>
+              </w:rPr>
+              <w:t>Sim(</w:t>
+            </w:r>
+            <w:proofErr w:type="gramEnd"/>
+            <w:r>
+              <w:rPr>
+                <w:rFonts w:ascii="Arial" w:hAnsi="Arial" w:cs="Arial"/>
+                <w:sz w:val="22"/>
+                <w:szCs w:val="22"/>
+              </w:rPr>
+              <w:t>5)</w:t>
+            </w:r>
+          </w:p>
+        </w:tc>
+        <w:tc>
+          <w:tcPr>
+            <w:tcW w:w="3636" w:type="dxa"/>
+          </w:tcPr>
+          <w:p>
+            <w:pPr>
+              <w:jc w:val="both"/>
+              <w:rPr>
+                <w:rFonts w:ascii="Arial" w:hAnsi="Arial" w:cs="Arial"/>
+                <w:sz w:val="22"/>
+                <w:szCs w:val="22"/>
+              </w:rPr>
+            </w:pPr>
+            <w:proofErr w:type="gramStart"/>
+            <w:r>
+              <w:rPr>
+                <w:rFonts w:ascii="Arial" w:hAnsi="Arial" w:cs="Arial"/>
+                <w:sz w:val="22"/>
+                <w:szCs w:val="22"/>
+              </w:rPr>
+              <w:t>Não(</w:t>
+            </w:r>
+            <w:proofErr w:type="gramEnd"/>
+            <w:r>
+              <w:rPr>
+                <w:rFonts w:ascii="Arial" w:hAnsi="Arial" w:cs="Arial"/>
+                <w:sz w:val="22"/>
+                <w:szCs w:val="22"/>
+              </w:rPr>
+              <w:t>6)</w:t>
+            </w:r>
+          </w:p>
+        </w:tc>
+      </w:tr>
+    </w:tbl>
+    <w:p>
+      <w:pPr>
+        <w:rPr>
+          <w:rFonts w:ascii="Arial" w:hAnsi="Arial" w:cs="Arial"/>
+          <w:color w:val="0070C0"/>
+        </w:rPr>
+      </w:pPr>
+    </w:p>
+    <w:p>
+      <w:pPr>
+        <w:rPr>
+          <w:rFonts w:ascii="Arial" w:hAnsi="Arial" w:cs="Arial"/>
+          <w:color w:val="0070C0"/>
+        </w:rPr>
+      </w:pPr>
+      <w:r>
+        <w:rPr>
+          <w:rFonts w:ascii="Arial" w:hAnsi="Arial" w:cs="Arial"/>
+          <w:color w:val="0070C0"/>
+        </w:rPr>
+        <w:t xml:space="preserve">Casos de teste classes válidas e inválidas </w:t>
+      </w:r>
+      <w:r>
+        <w:rPr>
+          <w:rFonts w:ascii="Arial" w:hAnsi="Arial" w:cs="Arial"/>
+          <w:color w:val="FF0000"/>
+          <w:u w:val="single"/>
+        </w:rPr>
+        <w:t>para CASA!!</w:t>
+      </w:r>
     </w:p>
     <w:p>
       <w:pPr>
@@ -12185,7 +16022,7 @@
   <w:abstractNum w:abstractNumId="0" w15:restartNumberingAfterBreak="0">
     <w:nsid w:val="05ED0487"/>
     <w:multiLevelType w:val="hybridMultilevel"/>
-    <w:tmpl w:val="E5AA4FDC"/>
+    <w:tmpl w:val="B096E524"/>
     <w:lvl w:ilvl="0" w:tplc="04160001">
       <w:start w:val="1"/>
       <w:numFmt w:val="bullet"/>
@@ -13764,7 +17601,7 @@
 </file>
 
 <file path=customXml/itemProps1.xml><?xml version="1.0" encoding="utf-8"?>
-<ds:datastoreItem xmlns:ds="http://schemas.openxmlformats.org/officeDocument/2006/customXml" ds:itemID="{3B0FF926-6FC2-4E89-8231-3FA716665D13}">
+<ds:datastoreItem xmlns:ds="http://schemas.openxmlformats.org/officeDocument/2006/customXml" ds:itemID="{A7D43B15-1CA8-4B95-8BB3-6D9B604372BB}">
   <ds:schemaRefs>
     <ds:schemaRef ds:uri="http://schemas.openxmlformats.org/officeDocument/2006/bibliography"/>
   </ds:schemaRefs>

</xml_diff>